<commit_message>
Wave 3: real-CCTV rewrite of analysis, deck, poster, README
- analysis.docx: leads with iso-bitrate sal-PSNR parity finding
  (+0.44 dB at ~45 KB), real neural-codec measurements in §5,
  sigmoid-mask methodology in §4, RD curve + qualitative figures
- showcase.pptx: 12 slides, all real-CCTV figures embedded
- poster.pdf/png: A3 booth poster with corrected sustainability math
- README.md: Status section with real-CCTV headline numbers
- docs/results_summary.md: single source of truth for every number
- src/pipeline.py: sigmoid mask is now the default operating mode
- src/compress.py: mask_mode parameter (alpha/sigmoid/binary)
- scripts/make_figures.py: regenerated for real-data plots
- scripts/build_analysis.js, make_poster.py: rewritten for new numbers
- scripts/ablation_mask_modes.py, ablation_sigmoid_sweep.py: methodology + RD ablations
</commit_message>
<xml_diff>
--- a/analysis.docx
+++ b/analysis.docx
@@ -76,7 +76,7 @@
           <w:sz w:val="24"/>
           <w:szCs w:val="24"/>
         </w:rPr>
-        <w:t xml:space="preserve">More than 95% of home-security camera footage is never watched. It is recorded, stored, served, and eventually overwritten without ever entering a human field of view. The footage still costs disk capacity, network bandwidth, and data-center electricity. As consumer surveillance scales toward billions of always-on cameras, the carbon footprint of unwatched video is becoming a real environmental concern. The Computer Science prompt for ICAC 2026 asks three connected questions: how can stored video be compressed using </w:t>
+        <w:t xml:space="preserve">More than 95% of home-security camera footage is never watched. It is recorded, stored, served, and eventually overwritten without ever entering a human field of view, yet still costs disk capacity, network bandwidth, and data-center electricity. The Computer Science prompt for ICAC 2026 asks three connected questions: how can stored video be compressed using </w:t>
       </w:r>
       <w:r>
         <w:rPr>
@@ -94,7 +94,7 @@
           <w:sz w:val="24"/>
           <w:szCs w:val="24"/>
         </w:rPr>
-        <w:t xml:space="preserve">; how can “useful” footage be automatically identified using sensor data; and what algorithms and edge-processing techniques make such a system scalable, privacy-conscious, and precise. This analysis answers all three with one coherent system.</w:t>
+        <w:t xml:space="preserve">; how can “useful” footage be automatically identified using sensor data; and what algorithms and edge-processing techniques make such a system scalable, privacy-conscious, and precise. We answer all three with one coherent system, evaluated on real CCTV footage spanning thirteen action classes from the public Kaggle CCTV Action-Recognition dataset (jonathannield/cctv-action-recognition-dataset).</w:t>
       </w:r>
     </w:p>
     <w:p>
@@ -112,7 +112,7 @@
           <w:sz w:val="24"/>
           <w:szCs w:val="24"/>
         </w:rPr>
-        <w:t xml:space="preserve">2. Our system in one sentence</w:t>
+        <w:t xml:space="preserve">2. Headline finding</w:t>
       </w:r>
     </w:p>
     <w:p>
@@ -125,25 +125,25 @@
           <w:sz w:val="24"/>
           <w:szCs w:val="24"/>
         </w:rPr>
-        <w:t xml:space="preserve">A real-time pipeline that uses a multi-signal sensor gate to decide when footage is worth recording at full fidelity, and applies </w:t>
-      </w:r>
-      <w:r>
-        <w:rPr>
-          <w:rFonts w:ascii="Times New Roman" w:cs="Times New Roman" w:eastAsia="Times New Roman" w:hAnsi="Times New Roman"/>
-          <w:i/>
-          <w:iCs/>
-          <w:sz w:val="24"/>
-          <w:szCs w:val="24"/>
-        </w:rPr>
-        <w:t xml:space="preserve">saliency-aware perceptual compression</w:t>
-      </w:r>
-      <w:r>
-        <w:rPr>
-          <w:rFonts w:ascii="Times New Roman" w:cs="Times New Roman" w:eastAsia="Times New Roman" w:hAnsi="Times New Roman"/>
-          <w:sz w:val="24"/>
-          <w:szCs w:val="24"/>
-        </w:rPr>
-        <w:t xml:space="preserve"> to every stored frame so that bits are spent where a human would actually look. The whole pipeline runs on commodity edge hardware—a laptop in our prototype—and produces real reductions in storage and bandwidth without compromising the regions of the frame that human attention privileges.</w:t>
+        <w:t xml:space="preserve">On 20 stratified real CCTV clips, our saliency-aware compression </w:t>
+      </w:r>
+      <w:r>
+        <w:rPr>
+          <w:rFonts w:ascii="Times New Roman" w:cs="Times New Roman" w:eastAsia="Times New Roman" w:hAnsi="Times New Roman"/>
+          <w:b/>
+          <w:bCs/>
+          <w:sz w:val="24"/>
+          <w:szCs w:val="24"/>
+        </w:rPr>
+        <w:t xml:space="preserve">matches uniform H.265 on saliency-preserved quality at the same file size in the bandwidth-constrained regime</w:t>
+      </w:r>
+      <w:r>
+        <w:rPr>
+          <w:rFonts w:ascii="Times New Roman" w:cs="Times New Roman" w:eastAsia="Times New Roman" w:hAnsi="Times New Roman"/>
+          <w:sz w:val="24"/>
+          <w:szCs w:val="24"/>
+        </w:rPr>
+        <w:t xml:space="preserve"> where edge surveillance actually operates. At ~45 KB per 30-second clip, our system delivers 26.29 dB saliency-PSNR versus 25.85 dB for baseline H.265 (uniform CRF 40, 44 KB). End-to-end processing runs at over 90 fps on a laptop CPU, and a small autoencoder we trained ourselves runs at 1.43 ms per frame on Apple M3 Pro — a first-person edge measurement that puts numbers on the “AI compression is 300× better, but we don’t use it” claim from the inspiration video (Lague, 2025).</w:t>
       </w:r>
     </w:p>
     <w:p>
@@ -174,7 +174,7 @@
           <w:sz w:val="24"/>
           <w:szCs w:val="24"/>
         </w:rPr>
-        <w:t xml:space="preserve">Perceptual video compression is grounded in roughly seventy years of visual neuroscience. Five principles motivate our design. </w:t>
+        <w:t xml:space="preserve">Five principles motivate our design. </w:t>
       </w:r>
       <w:r>
         <w:rPr>
@@ -210,7 +210,7 @@
           <w:sz w:val="24"/>
           <w:szCs w:val="24"/>
         </w:rPr>
-        <w:t xml:space="preserve"> peaks near 4 cycles per degree and falls at very low or very high spatial frequencies; JPEG’s quantization matrix was derived directly from CSF data (Campbell &amp; Robson, 1968). </w:t>
+        <w:t xml:space="preserve"> peaks near 4 cycles per degree; JPEG’s quantization matrix was derived directly from CSF data (Campbell &amp; Robson, 1968). </w:t>
       </w:r>
       <w:r>
         <w:rPr>
@@ -228,7 +228,7 @@
           <w:sz w:val="24"/>
           <w:szCs w:val="24"/>
         </w:rPr>
-        <w:t xml:space="preserve"> defines the threshold below which distortion is invisible; modern codecs tune quantization to stay below it (Mannos &amp; Sakrison, 1974; Yang et al., 2005). </w:t>
+        <w:t xml:space="preserve"> defines the threshold below which distortion is invisible (Mannos &amp; Sakrison, 1974; Yang et al., 2005). </w:t>
       </w:r>
       <w:r>
         <w:rPr>
@@ -246,7 +246,7 @@
           <w:sz w:val="24"/>
           <w:szCs w:val="24"/>
         </w:rPr>
-        <w:t xml:space="preserve"> make distortion harder to detect in textured or moving regions, which HEVC exploits in its perceptual rate-distortion mode (Sullivan et al., 2012). Finally, </w:t>
+        <w:t xml:space="preserve"> make distortion harder to detect in textured or moving regions, exploited in HEVC (Sullivan et al., 2012). </w:t>
       </w:r>
       <w:r>
         <w:rPr>
@@ -256,15 +256,15 @@
           <w:sz w:val="24"/>
           <w:szCs w:val="24"/>
         </w:rPr>
-        <w:t xml:space="preserve">saliency</w:t>
-      </w:r>
-      <w:r>
-        <w:rPr>
-          <w:rFonts w:ascii="Times New Roman" w:cs="Times New Roman" w:eastAsia="Times New Roman" w:hAnsi="Times New Roman"/>
-          <w:sz w:val="24"/>
-          <w:szCs w:val="24"/>
-        </w:rPr>
-        <w:t xml:space="preserve"> — the bottom-up measure of where in a scene visual attention is drawn — correlates strongly with human eye-tracking data (Itti, Koch &amp; Niebur, 1998; Borji &amp; Itti, 2013), and serves as a tractable proxy for “where distortion will hurt.” Our system uses saliency to direct bit allocation; JND and masking bound how aggressively we quantize outside the salient region; CSF and foveation provide the theoretical guarantee that this approach is grounded rather than ad-hoc.</w:t>
+        <w:t xml:space="preserve">Saliency</w:t>
+      </w:r>
+      <w:r>
+        <w:rPr>
+          <w:rFonts w:ascii="Times New Roman" w:cs="Times New Roman" w:eastAsia="Times New Roman" w:hAnsi="Times New Roman"/>
+          <w:sz w:val="24"/>
+          <w:szCs w:val="24"/>
+        </w:rPr>
+        <w:t xml:space="preserve"> — bottom-up attention — correlates strongly with eye-tracking ground truth (Itti, Koch &amp; Niebur, 1998) and serves as a tractable proxy for “where distortion will hurt.” Our system uses saliency to direct bit allocation; JND and masking bound how aggressively we quantize outside salient regions; CSF and foveation provide the theoretical guarantee that this is principled rather than ad-hoc.</w:t>
       </w:r>
     </w:p>
     <w:p>
@@ -313,7 +313,7 @@
           <w:sz w:val="24"/>
           <w:szCs w:val="24"/>
         </w:rPr>
-        <w:t xml:space="preserve"> runs always-on, classifying each incoming frame as “useful” or “idle” using a fusion of signals: MOG2 background subtraction, sparse Lucas-Kanade optical flow, optional on-device YOLOv8n person detection, and (planned) YAMNet audio event detection. The fusion is a weighted sum of normalised confidences with a tunable threshold. </w:t>
+        <w:t xml:space="preserve"> runs always-on: MOG2 background subtraction plus sparse Lucas-Kanade optical flow are fused into a per-frame “usefulness” score. On real CCTV the gate triggers on 65.2 % of frames — consistent with the dense activity in action-recognition footage. </w:t>
       </w:r>
       <w:r>
         <w:rPr>
@@ -331,7 +331,7 @@
           <w:sz w:val="24"/>
           <w:szCs w:val="24"/>
         </w:rPr>
-        <w:t xml:space="preserve"> produces a per-frame attention map. Our prototype uses Hou and Zhang’s spectral-residual saliency (2007), which runs at over 100 fps on a laptop CPU; the architecture is designed to drop in a learned model such as TASED-Net when target hardware permits. </w:t>
+        <w:t xml:space="preserve"> produces a per-frame attention map via Hou and Zhang’s spectral-residual algorithm (&gt;100 fps on a laptop CPU); a learned model such as TASED-Net is a drop-in upgrade. </w:t>
       </w:r>
       <w:r>
         <w:rPr>
@@ -349,7 +349,7 @@
           <w:sz w:val="24"/>
           <w:szCs w:val="24"/>
         </w:rPr>
-        <w:t xml:space="preserve"> converts the saliency map to a per-block quantization map and feeds an H.265 encoder. In our day-one prototype we approximate this with spatially-adaptive Gaussian blur prior to a uniform-quality H.265 encode; the upgrade path to true per-block QP via libx265’s ROI API is documented in code. All three subsystems communicate through a small in-process API and run end-to-end at over 90 fps on a laptop CPU.</w:t>
+        <w:t xml:space="preserve"> converts the saliency map into a per-pixel sharp/blur weight via a steep sigmoid (threshold 0.4, steepness 12) and feeds H.265 a frame whose non-salient regions have already been low-pass filtered. The sigmoid shaping is empirically critical: replacing the legacy soft alpha-blend with a sigmoid mask raised saliency-PSNR by 6.6 dB at parity bitrate (alpha 22.0 dB → sigmoid 28.6 dB at CRF 28, see §7).</w:t>
       </w:r>
     </w:p>
     <w:p>
@@ -448,7 +448,7 @@
           <w:sz w:val="24"/>
           <w:szCs w:val="24"/>
         </w:rPr>
-        <w:t xml:space="preserve">Recent work claims that learned, autoencoder-based video codecs can outperform H.265 by 5–15% in BD-rate (Lu et al., 2019; He et al., 2022; Mentzer et al., 2022). A recent popular-science treatment (Lague, 2025) put the cumulative theoretical compression gain at “300× better” on idealized inputs. Yet no consumer home camera ships a neural codec. Four constraints explain the gap. </w:t>
+        <w:t xml:space="preserve">Recent work claims learned video codecs beat H.265 by 5–15 % BD-rate (Lu et al., 2019; He et al., 2022; Mentzer et al., 2022); a popular treatment (Lague, 2025) puts the cumulative theoretical gain at 300× under idealised conditions. We trained one ourselves to find out what actually ships. Our 76 131-parameter convolutional autoencoder, trained on 1 997 frames sampled across the full 2 288-clip Kaggle dataset (30 epochs, ~80 s on Apple M3 Pro MPS), achieves </w:t>
       </w:r>
       <w:r>
         <w:rPr>
@@ -458,15 +458,15 @@
           <w:sz w:val="24"/>
           <w:szCs w:val="24"/>
         </w:rPr>
-        <w:t xml:space="preserve">Inference latency</w:t>
-      </w:r>
-      <w:r>
-        <w:rPr>
-          <w:rFonts w:ascii="Times New Roman" w:cs="Times New Roman" w:eastAsia="Times New Roman" w:hAnsi="Times New Roman"/>
-          <w:sz w:val="24"/>
-          <w:szCs w:val="24"/>
-        </w:rPr>
-        <w:t xml:space="preserve">: even compact learned codecs run at 100–2000 ms per frame on edge hardware, against the ~33 ms budget for real-time 30 fps capture. </w:t>
+        <w:t xml:space="preserve">28.95 dB reconstruction PSNR at 6× compression</w:t>
+      </w:r>
+      <w:r>
+        <w:rPr>
+          <w:rFonts w:ascii="Times New Roman" w:cs="Times New Roman" w:eastAsia="Times New Roman" w:hAnsi="Times New Roman"/>
+          <w:sz w:val="24"/>
+          <w:szCs w:val="24"/>
+        </w:rPr>
+        <w:t xml:space="preserve">, encodes in </w:t>
       </w:r>
       <w:r>
         <w:rPr>
@@ -476,64 +476,51 @@
           <w:sz w:val="24"/>
           <w:szCs w:val="24"/>
         </w:rPr>
-        <w:t xml:space="preserve">Model size</w:t>
-      </w:r>
-      <w:r>
-        <w:rPr>
-          <w:rFonts w:ascii="Times New Roman" w:cs="Times New Roman" w:eastAsia="Times New Roman" w:hAnsi="Times New Roman"/>
-          <w:sz w:val="24"/>
-          <w:szCs w:val="24"/>
-        </w:rPr>
-        <w:t xml:space="preserve">: typical learned codec weights are 50–300 MB — a substantial fraction of available RAM on a Raspberry Pi 4 or comparable embedded CPU. </w:t>
-      </w:r>
-      <w:r>
-        <w:rPr>
-          <w:rFonts w:ascii="Times New Roman" w:cs="Times New Roman" w:eastAsia="Times New Roman" w:hAnsi="Times New Roman"/>
-          <w:b/>
-          <w:bCs/>
-          <w:sz w:val="24"/>
-          <w:szCs w:val="24"/>
-        </w:rPr>
-        <w:t xml:space="preserve">Memory bandwidth</w:t>
-      </w:r>
-      <w:r>
-        <w:rPr>
-          <w:rFonts w:ascii="Times New Roman" w:cs="Times New Roman" w:eastAsia="Times New Roman" w:hAnsi="Times New Roman"/>
-          <w:sz w:val="24"/>
-          <w:szCs w:val="24"/>
-        </w:rPr>
-        <w:t xml:space="preserve">: neural codecs require several GB/s of feature-tensor traffic; edge SBCs deliver a fraction of that, making bandwidth (not compute) the bottleneck. </w:t>
-      </w:r>
-      <w:r>
-        <w:rPr>
-          <w:rFonts w:ascii="Times New Roman" w:cs="Times New Roman" w:eastAsia="Times New Roman" w:hAnsi="Times New Roman"/>
-          <w:b/>
-          <w:bCs/>
-          <w:sz w:val="24"/>
-          <w:szCs w:val="24"/>
-        </w:rPr>
-        <w:t xml:space="preserve">Hardware acceleration</w:t>
-      </w:r>
-      <w:r>
-        <w:rPr>
-          <w:rFonts w:ascii="Times New Roman" w:cs="Times New Roman" w:eastAsia="Times New Roman" w:hAnsi="Times New Roman"/>
-          <w:sz w:val="24"/>
-          <w:szCs w:val="24"/>
-        </w:rPr>
-        <w:t xml:space="preserve">: every modern surveillance SoC includes a dedicated H.264/H.265 block; none currently include a neural-codec block. The cost ratio between dedicated silicon and general-purpose neural inference is several orders of magnitude in this regime.</w:t>
-      </w:r>
-    </w:p>
-    <w:p>
-      <w:pPr>
-        <w:spacing w:after="80" w:before="0" w:line="276" w:lineRule="auto"/>
-      </w:pPr>
-      <w:r>
-        <w:rPr>
-          <w:rFonts w:ascii="Times New Roman" w:cs="Times New Roman" w:eastAsia="Times New Roman" w:hAnsi="Times New Roman"/>
-          <w:sz w:val="24"/>
-          <w:szCs w:val="24"/>
-        </w:rPr>
-        <w:t xml:space="preserve">Our system takes the philosophy that motivates neural codecs — spend bits where humans actually perceive them — and realises it on classical rails. A small saliency network (or, in our prototype, a spectral-residual classical method) drives a production codec’s rate allocation, paying milliseconds rather than seconds, and adding no new silicon requirement. We borrow the perceptual gain without paying the deployment cost.</w:t>
+        <w:t xml:space="preserve">1.43 ms per frame</w:t>
+      </w:r>
+      <w:r>
+        <w:rPr>
+          <w:rFonts w:ascii="Times New Roman" w:cs="Times New Roman" w:eastAsia="Times New Roman" w:hAnsi="Times New Roman"/>
+          <w:sz w:val="24"/>
+          <w:szCs w:val="24"/>
+        </w:rPr>
+        <w:t xml:space="preserve"> and decodes in 1.35 ms. The weights occupy 310 KB on disk. So small autoencoders </w:t>
+      </w:r>
+      <w:r>
+        <w:rPr>
+          <w:rFonts w:ascii="Times New Roman" w:cs="Times New Roman" w:eastAsia="Times New Roman" w:hAnsi="Times New Roman"/>
+          <w:i/>
+          <w:iCs/>
+          <w:sz w:val="24"/>
+          <w:szCs w:val="24"/>
+        </w:rPr>
+        <w:t xml:space="preserve">can</w:t>
+      </w:r>
+      <w:r>
+        <w:rPr>
+          <w:rFonts w:ascii="Times New Roman" w:cs="Times New Roman" w:eastAsia="Times New Roman" w:hAnsi="Times New Roman"/>
+          <w:sz w:val="24"/>
+          <w:szCs w:val="24"/>
+        </w:rPr>
+        <w:t xml:space="preserve"> run on edge hardware in real time. What they cannot do is match a dedicated codec on quality: at the same compression ratio, uniform H.265 reaches 36.65 dB — a 7-plus dB advantage that does not collapse with model scale alone. The latency-versus-quality wall holds. Larger learned codecs reach H.265 quality but at 100–2000 ms per frame and 50–300 MB of weights (literature; Mentzer et al. 2022). Our system therefore </w:t>
+      </w:r>
+      <w:r>
+        <w:rPr>
+          <w:rFonts w:ascii="Times New Roman" w:cs="Times New Roman" w:eastAsia="Times New Roman" w:hAnsi="Times New Roman"/>
+          <w:i/>
+          <w:iCs/>
+          <w:sz w:val="24"/>
+          <w:szCs w:val="24"/>
+        </w:rPr>
+        <w:t xml:space="preserve">borrows the perceptual-allocation philosophy of neural codecs and realises it on classical codec rails</w:t>
+      </w:r>
+      <w:r>
+        <w:rPr>
+          <w:rFonts w:ascii="Times New Roman" w:cs="Times New Roman" w:eastAsia="Times New Roman" w:hAnsi="Times New Roman"/>
+          <w:sz w:val="24"/>
+          <w:szCs w:val="24"/>
+        </w:rPr>
+        <w:t xml:space="preserve">, paying milliseconds rather than seconds, and adding no new silicon requirement.</w:t>
       </w:r>
     </w:p>
     <w:p>
@@ -564,20 +551,15 @@
           <w:sz w:val="24"/>
           <w:szCs w:val="24"/>
         </w:rPr>
-        <w:t xml:space="preserve">All inference in our pipeline is on-device. Raw frames never leave the camera; only an event log of semantic labels and timestamps is exported, and full-fidelity clips are uploaded selectively when the gate fires. This pattern — already used by major consumer camera vendors — satisfies GDPR and CCPA preferences for edge processing, and shrinks the attack surface in the case of device compromise. The architecture is also compatible with future federated fine-tuning, which would let each household improve its detectors without sharing video.</w:t>
-      </w:r>
-    </w:p>
-    <w:p>
-      <w:pPr>
-        <w:spacing w:after="80" w:before="0" w:line="276" w:lineRule="auto"/>
-      </w:pPr>
-      <w:r>
-        <w:rPr>
-          <w:rFonts w:ascii="Times New Roman" w:cs="Times New Roman" w:eastAsia="Times New Roman" w:hAnsi="Times New Roman"/>
-          <w:sz w:val="24"/>
-          <w:szCs w:val="24"/>
-        </w:rPr>
-        <w:t xml:space="preserve">Sustainability is more than a slogan in this domain. Using our measured 23.4% relative bitrate reduction at fixed CRF and a typical home-camera baseline of 1.5 Mbps H.265, each deployed camera saves on the order of 1.35 TB of stored-and-served video per year. At a data-centre energy intensity of 0.06 kWh per stored gigabyte (Masanet et al., 2020) and a US-grid average of 0.4 kg CO₂ per kWh, that is roughly 32 kg of CO₂ per camera per year, or 32 tonnes of CO₂ annually for a deployment of one thousand cameras. Order-of-magnitude assumptions are stated explicitly so the numbers can be re-evaluated as grid intensity falls.</w:t>
+        <w:t xml:space="preserve">All inference is on-device. Raw frames never leave the camera; only an event log of semantic labels and timestamps is exported, and full-fidelity clips upload selectively when the gate fires. This pattern — already used by major consumer camera vendors — satisfies GDPR and CCPA preferences for edge processing and shrinks the attack surface in the case of device compromise. </w:t>
+      </w:r>
+      <w:r>
+        <w:rPr>
+          <w:rFonts w:ascii="Times New Roman" w:cs="Times New Roman" w:eastAsia="Times New Roman" w:hAnsi="Times New Roman"/>
+          <w:sz w:val="24"/>
+          <w:szCs w:val="24"/>
+        </w:rPr>
+        <w:t xml:space="preserve">At fixed encoder CRF target our system produces 23 % smaller files than uniform H.265; using a typical home-camera baseline of 1.5 Mbps and 0.06 kWh per stored gigabyte (Masanet et al., 2020) on a US grid (0.4 kg CO₂/kWh, EPA average), each deployed camera saves roughly 1.35 TB of stored-and-served video and 32 kg CO₂ per year. At a one-thousand-camera deployment that is approximately 32 tonnes CO₂ annually.</w:t>
       </w:r>
     </w:p>
     <w:p>
@@ -608,7 +590,7 @@
           <w:sz w:val="24"/>
           <w:szCs w:val="24"/>
         </w:rPr>
-        <w:t xml:space="preserve">We evaluated the system on a 30-second synthetic indoor surveillance scene (textured background, two scripted person-walks-through events, ground-truth event windows). Public surveillance datasets such as VIRAT and Avenue could not be retrieved from the development environment used here and are the immediate next test target. Table 1 summarises the headline ablation results.</w:t>
+        <w:t xml:space="preserve">Twenty stratified clips spanning thirteen action classes (fall, fight/hit, kick, gun, robbery, walk, sit, lying-down, stand, sneak, run, struggle, throw) drive every measurement below. Table 1 anchors the comparison.</w:t>
       </w:r>
     </w:p>
     <w:tbl>
@@ -624,17 +606,17 @@
         </w:tblBorders>
       </w:tblPr>
       <w:tblGrid>
-        <w:gridCol w:w="2200"/>
-        <w:gridCol w:w="1100"/>
-        <w:gridCol w:w="1100"/>
-        <w:gridCol w:w="1640"/>
-        <w:gridCol w:w="1320"/>
-        <w:gridCol w:w="2000"/>
+        <w:gridCol w:w="1900"/>
+        <w:gridCol w:w="900"/>
+        <w:gridCol w:w="1500"/>
+        <w:gridCol w:w="1500"/>
+        <w:gridCol w:w="1700"/>
+        <w:gridCol w:w="1860"/>
       </w:tblGrid>
       <w:tr>
         <w:tc>
           <w:tcPr>
-            <w:tcW w:type="dxa" w:w="2200"/>
+            <w:tcW w:type="dxa" w:w="1900"/>
             <w:tcBorders>
               <w:top w:val="single" w:color="BBBBBB" w:sz="4"/>
               <w:left w:val="single" w:color="BBBBBB" w:sz="4"/>
@@ -667,7 +649,7 @@
         </w:tc>
         <w:tc>
           <w:tcPr>
-            <w:tcW w:type="dxa" w:w="1100"/>
+            <w:tcW w:type="dxa" w:w="900"/>
             <w:tcBorders>
               <w:top w:val="single" w:color="BBBBBB" w:sz="4"/>
               <w:left w:val="single" w:color="BBBBBB" w:sz="4"/>
@@ -700,7 +682,7 @@
         </w:tc>
         <w:tc>
           <w:tcPr>
-            <w:tcW w:type="dxa" w:w="1100"/>
+            <w:tcW w:type="dxa" w:w="1500"/>
             <w:tcBorders>
               <w:top w:val="single" w:color="BBBBBB" w:sz="4"/>
               <w:left w:val="single" w:color="BBBBBB" w:sz="4"/>
@@ -727,13 +709,13 @@
                 <w:sz w:val="20"/>
                 <w:szCs w:val="20"/>
               </w:rPr>
-              <w:t xml:space="preserve">Blur</w:t>
-            </w:r>
-          </w:p>
-        </w:tc>
-        <w:tc>
-          <w:tcPr>
-            <w:tcW w:type="dxa" w:w="1640"/>
+              <w:t xml:space="preserve">Size (KB)</w:t>
+            </w:r>
+          </w:p>
+        </w:tc>
+        <w:tc>
+          <w:tcPr>
+            <w:tcW w:type="dxa" w:w="1500"/>
             <w:tcBorders>
               <w:top w:val="single" w:color="BBBBBB" w:sz="4"/>
               <w:left w:val="single" w:color="BBBBBB" w:sz="4"/>
@@ -760,13 +742,13 @@
                 <w:sz w:val="20"/>
                 <w:szCs w:val="20"/>
               </w:rPr>
-              <w:t xml:space="preserve">Size (KB)</w:t>
-            </w:r>
-          </w:p>
-        </w:tc>
-        <w:tc>
-          <w:tcPr>
-            <w:tcW w:type="dxa" w:w="1320"/>
+              <w:t xml:space="preserve">PSNR (dB)</w:t>
+            </w:r>
+          </w:p>
+        </w:tc>
+        <w:tc>
+          <w:tcPr>
+            <w:tcW w:type="dxa" w:w="1700"/>
             <w:tcBorders>
               <w:top w:val="single" w:color="BBBBBB" w:sz="4"/>
               <w:left w:val="single" w:color="BBBBBB" w:sz="4"/>
@@ -793,13 +775,13 @@
                 <w:sz w:val="20"/>
                 <w:szCs w:val="20"/>
               </w:rPr>
-              <w:t xml:space="preserve">PSNR</w:t>
-            </w:r>
-          </w:p>
-        </w:tc>
-        <w:tc>
-          <w:tcPr>
-            <w:tcW w:type="dxa" w:w="2000"/>
+              <w:t xml:space="preserve">Sal-PSNR (dB)</w:t>
+            </w:r>
+          </w:p>
+        </w:tc>
+        <w:tc>
+          <w:tcPr>
+            <w:tcW w:type="dxa" w:w="1860"/>
             <w:tcBorders>
               <w:top w:val="single" w:color="BBBBBB" w:sz="4"/>
               <w:left w:val="single" w:color="BBBBBB" w:sz="4"/>
@@ -826,7 +808,7 @@
                 <w:sz w:val="20"/>
                 <w:szCs w:val="20"/>
               </w:rPr>
-              <w:t xml:space="preserve">Trigger</w:t>
+              <w:t xml:space="preserve">LPIPS</w:t>
             </w:r>
           </w:p>
         </w:tc>
@@ -834,7 +816,7 @@
       <w:tr>
         <w:tc>
           <w:tcPr>
-            <w:tcW w:type="dxa" w:w="2200"/>
+            <w:tcW w:type="dxa" w:w="1900"/>
             <w:tcBorders>
               <w:top w:val="single" w:color="BBBBBB" w:sz="4"/>
               <w:left w:val="single" w:color="BBBBBB" w:sz="4"/>
@@ -860,13 +842,13 @@
                 <w:sz w:val="20"/>
                 <w:szCs w:val="20"/>
               </w:rPr>
-              <w:t xml:space="preserve">baseline_crf28</w:t>
-            </w:r>
-          </w:p>
-        </w:tc>
-        <w:tc>
-          <w:tcPr>
-            <w:tcW w:type="dxa" w:w="1100"/>
+              <w:t xml:space="preserve">baseline (uniform H.265)</w:t>
+            </w:r>
+          </w:p>
+        </w:tc>
+        <w:tc>
+          <w:tcPr>
+            <w:tcW w:type="dxa" w:w="900"/>
             <w:tcBorders>
               <w:top w:val="single" w:color="BBBBBB" w:sz="4"/>
               <w:left w:val="single" w:color="BBBBBB" w:sz="4"/>
@@ -898,129 +880,129 @@
         </w:tc>
         <w:tc>
           <w:tcPr>
-            <w:tcW w:type="dxa" w:w="1100"/>
-            <w:tcBorders>
-              <w:top w:val="single" w:color="BBBBBB" w:sz="4"/>
-              <w:left w:val="single" w:color="BBBBBB" w:sz="4"/>
-              <w:bottom w:val="single" w:color="BBBBBB" w:sz="4"/>
-              <w:right w:val="single" w:color="BBBBBB" w:sz="4"/>
-            </w:tcBorders>
-            <w:tcMar>
-              <w:top w:type="dxa" w:w="60"/>
-              <w:left w:type="dxa" w:w="80"/>
-              <w:bottom w:type="dxa" w:w="60"/>
-              <w:right w:type="dxa" w:w="80"/>
-            </w:tcMar>
-          </w:tcPr>
-          <w:p>
-            <w:pPr>
-              <w:jc w:val="center"/>
-            </w:pPr>
-            <w:r>
-              <w:rPr>
-                <w:rFonts w:ascii="Times New Roman" w:cs="Times New Roman" w:eastAsia="Times New Roman" w:hAnsi="Times New Roman"/>
-                <w:b w:val="false"/>
-                <w:bCs w:val="false"/>
-                <w:sz w:val="20"/>
-                <w:szCs w:val="20"/>
-              </w:rPr>
-              <w:t xml:space="preserve">—</w:t>
-            </w:r>
-          </w:p>
-        </w:tc>
-        <w:tc>
-          <w:tcPr>
-            <w:tcW w:type="dxa" w:w="1640"/>
-            <w:tcBorders>
-              <w:top w:val="single" w:color="BBBBBB" w:sz="4"/>
-              <w:left w:val="single" w:color="BBBBBB" w:sz="4"/>
-              <w:bottom w:val="single" w:color="BBBBBB" w:sz="4"/>
-              <w:right w:val="single" w:color="BBBBBB" w:sz="4"/>
-            </w:tcBorders>
-            <w:tcMar>
-              <w:top w:type="dxa" w:w="60"/>
-              <w:left w:type="dxa" w:w="80"/>
-              <w:bottom w:type="dxa" w:w="60"/>
-              <w:right w:type="dxa" w:w="80"/>
-            </w:tcMar>
-          </w:tcPr>
-          <w:p>
-            <w:pPr>
-              <w:jc w:val="center"/>
-            </w:pPr>
-            <w:r>
-              <w:rPr>
-                <w:rFonts w:ascii="Times New Roman" w:cs="Times New Roman" w:eastAsia="Times New Roman" w:hAnsi="Times New Roman"/>
-                <w:b w:val="false"/>
-                <w:bCs w:val="false"/>
-                <w:sz w:val="20"/>
-                <w:szCs w:val="20"/>
-              </w:rPr>
-              <w:t xml:space="preserve">113.7</w:t>
-            </w:r>
-          </w:p>
-        </w:tc>
-        <w:tc>
-          <w:tcPr>
-            <w:tcW w:type="dxa" w:w="1320"/>
-            <w:tcBorders>
-              <w:top w:val="single" w:color="BBBBBB" w:sz="4"/>
-              <w:left w:val="single" w:color="BBBBBB" w:sz="4"/>
-              <w:bottom w:val="single" w:color="BBBBBB" w:sz="4"/>
-              <w:right w:val="single" w:color="BBBBBB" w:sz="4"/>
-            </w:tcBorders>
-            <w:tcMar>
-              <w:top w:type="dxa" w:w="60"/>
-              <w:left w:type="dxa" w:w="80"/>
-              <w:bottom w:type="dxa" w:w="60"/>
-              <w:right w:type="dxa" w:w="80"/>
-            </w:tcMar>
-          </w:tcPr>
-          <w:p>
-            <w:pPr>
-              <w:jc w:val="center"/>
-            </w:pPr>
-            <w:r>
-              <w:rPr>
-                <w:rFonts w:ascii="Times New Roman" w:cs="Times New Roman" w:eastAsia="Times New Roman" w:hAnsi="Times New Roman"/>
-                <w:b w:val="false"/>
-                <w:bCs w:val="false"/>
-                <w:sz w:val="20"/>
-                <w:szCs w:val="20"/>
-              </w:rPr>
-              <w:t xml:space="preserve">33.19</w:t>
-            </w:r>
-          </w:p>
-        </w:tc>
-        <w:tc>
-          <w:tcPr>
-            <w:tcW w:type="dxa" w:w="2000"/>
-            <w:tcBorders>
-              <w:top w:val="single" w:color="BBBBBB" w:sz="4"/>
-              <w:left w:val="single" w:color="BBBBBB" w:sz="4"/>
-              <w:bottom w:val="single" w:color="BBBBBB" w:sz="4"/>
-              <w:right w:val="single" w:color="BBBBBB" w:sz="4"/>
-            </w:tcBorders>
-            <w:tcMar>
-              <w:top w:type="dxa" w:w="60"/>
-              <w:left w:type="dxa" w:w="80"/>
-              <w:bottom w:type="dxa" w:w="60"/>
-              <w:right w:type="dxa" w:w="80"/>
-            </w:tcMar>
-          </w:tcPr>
-          <w:p>
-            <w:pPr>
-              <w:jc w:val="center"/>
-            </w:pPr>
-            <w:r>
-              <w:rPr>
-                <w:rFonts w:ascii="Times New Roman" w:cs="Times New Roman" w:eastAsia="Times New Roman" w:hAnsi="Times New Roman"/>
-                <w:b w:val="false"/>
-                <w:bCs w:val="false"/>
-                <w:sz w:val="20"/>
-                <w:szCs w:val="20"/>
-              </w:rPr>
-              <w:t xml:space="preserve">—</w:t>
+            <w:tcW w:type="dxa" w:w="1500"/>
+            <w:tcBorders>
+              <w:top w:val="single" w:color="BBBBBB" w:sz="4"/>
+              <w:left w:val="single" w:color="BBBBBB" w:sz="4"/>
+              <w:bottom w:val="single" w:color="BBBBBB" w:sz="4"/>
+              <w:right w:val="single" w:color="BBBBBB" w:sz="4"/>
+            </w:tcBorders>
+            <w:tcMar>
+              <w:top w:type="dxa" w:w="60"/>
+              <w:left w:type="dxa" w:w="80"/>
+              <w:bottom w:type="dxa" w:w="60"/>
+              <w:right w:type="dxa" w:w="80"/>
+            </w:tcMar>
+          </w:tcPr>
+          <w:p>
+            <w:pPr>
+              <w:jc w:val="center"/>
+            </w:pPr>
+            <w:r>
+              <w:rPr>
+                <w:rFonts w:ascii="Times New Roman" w:cs="Times New Roman" w:eastAsia="Times New Roman" w:hAnsi="Times New Roman"/>
+                <w:b w:val="false"/>
+                <w:bCs w:val="false"/>
+                <w:sz w:val="20"/>
+                <w:szCs w:val="20"/>
+              </w:rPr>
+              <w:t xml:space="preserve">128</w:t>
+            </w:r>
+          </w:p>
+        </w:tc>
+        <w:tc>
+          <w:tcPr>
+            <w:tcW w:type="dxa" w:w="1500"/>
+            <w:tcBorders>
+              <w:top w:val="single" w:color="BBBBBB" w:sz="4"/>
+              <w:left w:val="single" w:color="BBBBBB" w:sz="4"/>
+              <w:bottom w:val="single" w:color="BBBBBB" w:sz="4"/>
+              <w:right w:val="single" w:color="BBBBBB" w:sz="4"/>
+            </w:tcBorders>
+            <w:tcMar>
+              <w:top w:type="dxa" w:w="60"/>
+              <w:left w:type="dxa" w:w="80"/>
+              <w:bottom w:type="dxa" w:w="60"/>
+              <w:right w:type="dxa" w:w="80"/>
+            </w:tcMar>
+          </w:tcPr>
+          <w:p>
+            <w:pPr>
+              <w:jc w:val="center"/>
+            </w:pPr>
+            <w:r>
+              <w:rPr>
+                <w:rFonts w:ascii="Times New Roman" w:cs="Times New Roman" w:eastAsia="Times New Roman" w:hAnsi="Times New Roman"/>
+                <w:b w:val="false"/>
+                <w:bCs w:val="false"/>
+                <w:sz w:val="20"/>
+                <w:szCs w:val="20"/>
+              </w:rPr>
+              <w:t xml:space="preserve">36.65</w:t>
+            </w:r>
+          </w:p>
+        </w:tc>
+        <w:tc>
+          <w:tcPr>
+            <w:tcW w:type="dxa" w:w="1700"/>
+            <w:tcBorders>
+              <w:top w:val="single" w:color="BBBBBB" w:sz="4"/>
+              <w:left w:val="single" w:color="BBBBBB" w:sz="4"/>
+              <w:bottom w:val="single" w:color="BBBBBB" w:sz="4"/>
+              <w:right w:val="single" w:color="BBBBBB" w:sz="4"/>
+            </w:tcBorders>
+            <w:tcMar>
+              <w:top w:type="dxa" w:w="60"/>
+              <w:left w:type="dxa" w:w="80"/>
+              <w:bottom w:type="dxa" w:w="60"/>
+              <w:right w:type="dxa" w:w="80"/>
+            </w:tcMar>
+          </w:tcPr>
+          <w:p>
+            <w:pPr>
+              <w:jc w:val="center"/>
+            </w:pPr>
+            <w:r>
+              <w:rPr>
+                <w:rFonts w:ascii="Times New Roman" w:cs="Times New Roman" w:eastAsia="Times New Roman" w:hAnsi="Times New Roman"/>
+                <w:b w:val="false"/>
+                <w:bCs w:val="false"/>
+                <w:sz w:val="20"/>
+                <w:szCs w:val="20"/>
+              </w:rPr>
+              <w:t xml:space="preserve">33.69</w:t>
+            </w:r>
+          </w:p>
+        </w:tc>
+        <w:tc>
+          <w:tcPr>
+            <w:tcW w:type="dxa" w:w="1860"/>
+            <w:tcBorders>
+              <w:top w:val="single" w:color="BBBBBB" w:sz="4"/>
+              <w:left w:val="single" w:color="BBBBBB" w:sz="4"/>
+              <w:bottom w:val="single" w:color="BBBBBB" w:sz="4"/>
+              <w:right w:val="single" w:color="BBBBBB" w:sz="4"/>
+            </w:tcBorders>
+            <w:tcMar>
+              <w:top w:type="dxa" w:w="60"/>
+              <w:left w:type="dxa" w:w="80"/>
+              <w:bottom w:type="dxa" w:w="60"/>
+              <w:right w:type="dxa" w:w="80"/>
+            </w:tcMar>
+          </w:tcPr>
+          <w:p>
+            <w:pPr>
+              <w:jc w:val="center"/>
+            </w:pPr>
+            <w:r>
+              <w:rPr>
+                <w:rFonts w:ascii="Times New Roman" w:cs="Times New Roman" w:eastAsia="Times New Roman" w:hAnsi="Times New Roman"/>
+                <w:b w:val="false"/>
+                <w:bCs w:val="false"/>
+                <w:sz w:val="20"/>
+                <w:szCs w:val="20"/>
+              </w:rPr>
+              <w:t xml:space="preserve">0.029</w:t>
             </w:r>
           </w:p>
         </w:tc>
@@ -1028,7 +1010,7 @@
       <w:tr>
         <w:tc>
           <w:tcPr>
-            <w:tcW w:type="dxa" w:w="2200"/>
+            <w:tcW w:type="dxa" w:w="1900"/>
             <w:tcBorders>
               <w:top w:val="single" w:color="BBBBBB" w:sz="4"/>
               <w:left w:val="single" w:color="BBBBBB" w:sz="4"/>
@@ -1054,13 +1036,13 @@
                 <w:sz w:val="20"/>
                 <w:szCs w:val="20"/>
               </w:rPr>
-              <w:t xml:space="preserve">baseline_crf34</w:t>
-            </w:r>
-          </w:p>
-        </w:tc>
-        <w:tc>
-          <w:tcPr>
-            <w:tcW w:type="dxa" w:w="1100"/>
+              <w:t xml:space="preserve">baseline (uniform H.265)</w:t>
+            </w:r>
+          </w:p>
+        </w:tc>
+        <w:tc>
+          <w:tcPr>
+            <w:tcW w:type="dxa" w:w="900"/>
             <w:tcBorders>
               <w:top w:val="single" w:color="BBBBBB" w:sz="4"/>
               <w:left w:val="single" w:color="BBBBBB" w:sz="4"/>
@@ -1092,129 +1074,129 @@
         </w:tc>
         <w:tc>
           <w:tcPr>
-            <w:tcW w:type="dxa" w:w="1100"/>
-            <w:tcBorders>
-              <w:top w:val="single" w:color="BBBBBB" w:sz="4"/>
-              <w:left w:val="single" w:color="BBBBBB" w:sz="4"/>
-              <w:bottom w:val="single" w:color="BBBBBB" w:sz="4"/>
-              <w:right w:val="single" w:color="BBBBBB" w:sz="4"/>
-            </w:tcBorders>
-            <w:tcMar>
-              <w:top w:type="dxa" w:w="60"/>
-              <w:left w:type="dxa" w:w="80"/>
-              <w:bottom w:type="dxa" w:w="60"/>
-              <w:right w:type="dxa" w:w="80"/>
-            </w:tcMar>
-          </w:tcPr>
-          <w:p>
-            <w:pPr>
-              <w:jc w:val="center"/>
-            </w:pPr>
-            <w:r>
-              <w:rPr>
-                <w:rFonts w:ascii="Times New Roman" w:cs="Times New Roman" w:eastAsia="Times New Roman" w:hAnsi="Times New Roman"/>
-                <w:b w:val="false"/>
-                <w:bCs w:val="false"/>
-                <w:sz w:val="20"/>
-                <w:szCs w:val="20"/>
-              </w:rPr>
-              <w:t xml:space="preserve">—</w:t>
-            </w:r>
-          </w:p>
-        </w:tc>
-        <w:tc>
-          <w:tcPr>
-            <w:tcW w:type="dxa" w:w="1640"/>
-            <w:tcBorders>
-              <w:top w:val="single" w:color="BBBBBB" w:sz="4"/>
-              <w:left w:val="single" w:color="BBBBBB" w:sz="4"/>
-              <w:bottom w:val="single" w:color="BBBBBB" w:sz="4"/>
-              <w:right w:val="single" w:color="BBBBBB" w:sz="4"/>
-            </w:tcBorders>
-            <w:tcMar>
-              <w:top w:type="dxa" w:w="60"/>
-              <w:left w:type="dxa" w:w="80"/>
-              <w:bottom w:type="dxa" w:w="60"/>
-              <w:right w:type="dxa" w:w="80"/>
-            </w:tcMar>
-          </w:tcPr>
-          <w:p>
-            <w:pPr>
-              <w:jc w:val="center"/>
-            </w:pPr>
-            <w:r>
-              <w:rPr>
-                <w:rFonts w:ascii="Times New Roman" w:cs="Times New Roman" w:eastAsia="Times New Roman" w:hAnsi="Times New Roman"/>
-                <w:b w:val="false"/>
-                <w:bCs w:val="false"/>
-                <w:sz w:val="20"/>
-                <w:szCs w:val="20"/>
-              </w:rPr>
-              <w:t xml:space="preserve">76.2</w:t>
-            </w:r>
-          </w:p>
-        </w:tc>
-        <w:tc>
-          <w:tcPr>
-            <w:tcW w:type="dxa" w:w="1320"/>
-            <w:tcBorders>
-              <w:top w:val="single" w:color="BBBBBB" w:sz="4"/>
-              <w:left w:val="single" w:color="BBBBBB" w:sz="4"/>
-              <w:bottom w:val="single" w:color="BBBBBB" w:sz="4"/>
-              <w:right w:val="single" w:color="BBBBBB" w:sz="4"/>
-            </w:tcBorders>
-            <w:tcMar>
-              <w:top w:type="dxa" w:w="60"/>
-              <w:left w:type="dxa" w:w="80"/>
-              <w:bottom w:type="dxa" w:w="60"/>
-              <w:right w:type="dxa" w:w="80"/>
-            </w:tcMar>
-          </w:tcPr>
-          <w:p>
-            <w:pPr>
-              <w:jc w:val="center"/>
-            </w:pPr>
-            <w:r>
-              <w:rPr>
-                <w:rFonts w:ascii="Times New Roman" w:cs="Times New Roman" w:eastAsia="Times New Roman" w:hAnsi="Times New Roman"/>
-                <w:b w:val="false"/>
-                <w:bCs w:val="false"/>
-                <w:sz w:val="20"/>
-                <w:szCs w:val="20"/>
-              </w:rPr>
-              <w:t xml:space="preserve">32.16</w:t>
-            </w:r>
-          </w:p>
-        </w:tc>
-        <w:tc>
-          <w:tcPr>
-            <w:tcW w:type="dxa" w:w="2000"/>
-            <w:tcBorders>
-              <w:top w:val="single" w:color="BBBBBB" w:sz="4"/>
-              <w:left w:val="single" w:color="BBBBBB" w:sz="4"/>
-              <w:bottom w:val="single" w:color="BBBBBB" w:sz="4"/>
-              <w:right w:val="single" w:color="BBBBBB" w:sz="4"/>
-            </w:tcBorders>
-            <w:tcMar>
-              <w:top w:type="dxa" w:w="60"/>
-              <w:left w:type="dxa" w:w="80"/>
-              <w:bottom w:type="dxa" w:w="60"/>
-              <w:right w:type="dxa" w:w="80"/>
-            </w:tcMar>
-          </w:tcPr>
-          <w:p>
-            <w:pPr>
-              <w:jc w:val="center"/>
-            </w:pPr>
-            <w:r>
-              <w:rPr>
-                <w:rFonts w:ascii="Times New Roman" w:cs="Times New Roman" w:eastAsia="Times New Roman" w:hAnsi="Times New Roman"/>
-                <w:b w:val="false"/>
-                <w:bCs w:val="false"/>
-                <w:sz w:val="20"/>
-                <w:szCs w:val="20"/>
-              </w:rPr>
-              <w:t xml:space="preserve">—</w:t>
+            <w:tcW w:type="dxa" w:w="1500"/>
+            <w:tcBorders>
+              <w:top w:val="single" w:color="BBBBBB" w:sz="4"/>
+              <w:left w:val="single" w:color="BBBBBB" w:sz="4"/>
+              <w:bottom w:val="single" w:color="BBBBBB" w:sz="4"/>
+              <w:right w:val="single" w:color="BBBBBB" w:sz="4"/>
+            </w:tcBorders>
+            <w:tcMar>
+              <w:top w:type="dxa" w:w="60"/>
+              <w:left w:type="dxa" w:w="80"/>
+              <w:bottom w:type="dxa" w:w="60"/>
+              <w:right w:type="dxa" w:w="80"/>
+            </w:tcMar>
+          </w:tcPr>
+          <w:p>
+            <w:pPr>
+              <w:jc w:val="center"/>
+            </w:pPr>
+            <w:r>
+              <w:rPr>
+                <w:rFonts w:ascii="Times New Roman" w:cs="Times New Roman" w:eastAsia="Times New Roman" w:hAnsi="Times New Roman"/>
+                <w:b w:val="false"/>
+                <w:bCs w:val="false"/>
+                <w:sz w:val="20"/>
+                <w:szCs w:val="20"/>
+              </w:rPr>
+              <w:t xml:space="preserve">73</w:t>
+            </w:r>
+          </w:p>
+        </w:tc>
+        <w:tc>
+          <w:tcPr>
+            <w:tcW w:type="dxa" w:w="1500"/>
+            <w:tcBorders>
+              <w:top w:val="single" w:color="BBBBBB" w:sz="4"/>
+              <w:left w:val="single" w:color="BBBBBB" w:sz="4"/>
+              <w:bottom w:val="single" w:color="BBBBBB" w:sz="4"/>
+              <w:right w:val="single" w:color="BBBBBB" w:sz="4"/>
+            </w:tcBorders>
+            <w:tcMar>
+              <w:top w:type="dxa" w:w="60"/>
+              <w:left w:type="dxa" w:w="80"/>
+              <w:bottom w:type="dxa" w:w="60"/>
+              <w:right w:type="dxa" w:w="80"/>
+            </w:tcMar>
+          </w:tcPr>
+          <w:p>
+            <w:pPr>
+              <w:jc w:val="center"/>
+            </w:pPr>
+            <w:r>
+              <w:rPr>
+                <w:rFonts w:ascii="Times New Roman" w:cs="Times New Roman" w:eastAsia="Times New Roman" w:hAnsi="Times New Roman"/>
+                <w:b w:val="false"/>
+                <w:bCs w:val="false"/>
+                <w:sz w:val="20"/>
+                <w:szCs w:val="20"/>
+              </w:rPr>
+              <w:t xml:space="preserve">33.12</w:t>
+            </w:r>
+          </w:p>
+        </w:tc>
+        <w:tc>
+          <w:tcPr>
+            <w:tcW w:type="dxa" w:w="1700"/>
+            <w:tcBorders>
+              <w:top w:val="single" w:color="BBBBBB" w:sz="4"/>
+              <w:left w:val="single" w:color="BBBBBB" w:sz="4"/>
+              <w:bottom w:val="single" w:color="BBBBBB" w:sz="4"/>
+              <w:right w:val="single" w:color="BBBBBB" w:sz="4"/>
+            </w:tcBorders>
+            <w:tcMar>
+              <w:top w:type="dxa" w:w="60"/>
+              <w:left w:type="dxa" w:w="80"/>
+              <w:bottom w:type="dxa" w:w="60"/>
+              <w:right w:type="dxa" w:w="80"/>
+            </w:tcMar>
+          </w:tcPr>
+          <w:p>
+            <w:pPr>
+              <w:jc w:val="center"/>
+            </w:pPr>
+            <w:r>
+              <w:rPr>
+                <w:rFonts w:ascii="Times New Roman" w:cs="Times New Roman" w:eastAsia="Times New Roman" w:hAnsi="Times New Roman"/>
+                <w:b w:val="false"/>
+                <w:bCs w:val="false"/>
+                <w:sz w:val="20"/>
+                <w:szCs w:val="20"/>
+              </w:rPr>
+              <w:t xml:space="preserve">29.69</w:t>
+            </w:r>
+          </w:p>
+        </w:tc>
+        <w:tc>
+          <w:tcPr>
+            <w:tcW w:type="dxa" w:w="1860"/>
+            <w:tcBorders>
+              <w:top w:val="single" w:color="BBBBBB" w:sz="4"/>
+              <w:left w:val="single" w:color="BBBBBB" w:sz="4"/>
+              <w:bottom w:val="single" w:color="BBBBBB" w:sz="4"/>
+              <w:right w:val="single" w:color="BBBBBB" w:sz="4"/>
+            </w:tcBorders>
+            <w:tcMar>
+              <w:top w:type="dxa" w:w="60"/>
+              <w:left w:type="dxa" w:w="80"/>
+              <w:bottom w:type="dxa" w:w="60"/>
+              <w:right w:type="dxa" w:w="80"/>
+            </w:tcMar>
+          </w:tcPr>
+          <w:p>
+            <w:pPr>
+              <w:jc w:val="center"/>
+            </w:pPr>
+            <w:r>
+              <w:rPr>
+                <w:rFonts w:ascii="Times New Roman" w:cs="Times New Roman" w:eastAsia="Times New Roman" w:hAnsi="Times New Roman"/>
+                <w:b w:val="false"/>
+                <w:bCs w:val="false"/>
+                <w:sz w:val="20"/>
+                <w:szCs w:val="20"/>
+              </w:rPr>
+              <w:t xml:space="preserve">0.060</w:t>
             </w:r>
           </w:p>
         </w:tc>
@@ -1222,7 +1204,7 @@
       <w:tr>
         <w:tc>
           <w:tcPr>
-            <w:tcW w:type="dxa" w:w="2200"/>
+            <w:tcW w:type="dxa" w:w="1900"/>
             <w:tcBorders>
               <w:top w:val="single" w:color="BBBBBB" w:sz="4"/>
               <w:left w:val="single" w:color="BBBBBB" w:sz="4"/>
@@ -1248,167 +1230,167 @@
                 <w:sz w:val="20"/>
                 <w:szCs w:val="20"/>
               </w:rPr>
-              <w:t xml:space="preserve">ours_b9_crf28</w:t>
-            </w:r>
-          </w:p>
-        </w:tc>
-        <w:tc>
-          <w:tcPr>
-            <w:tcW w:type="dxa" w:w="1100"/>
-            <w:tcBorders>
-              <w:top w:val="single" w:color="BBBBBB" w:sz="4"/>
-              <w:left w:val="single" w:color="BBBBBB" w:sz="4"/>
-              <w:bottom w:val="single" w:color="BBBBBB" w:sz="4"/>
-              <w:right w:val="single" w:color="BBBBBB" w:sz="4"/>
-            </w:tcBorders>
-            <w:tcMar>
-              <w:top w:type="dxa" w:w="60"/>
-              <w:left w:type="dxa" w:w="80"/>
-              <w:bottom w:type="dxa" w:w="60"/>
-              <w:right w:type="dxa" w:w="80"/>
-            </w:tcMar>
-          </w:tcPr>
-          <w:p>
-            <w:pPr>
-              <w:jc w:val="center"/>
-            </w:pPr>
-            <w:r>
-              <w:rPr>
-                <w:rFonts w:ascii="Times New Roman" w:cs="Times New Roman" w:eastAsia="Times New Roman" w:hAnsi="Times New Roman"/>
-                <w:b w:val="false"/>
-                <w:bCs w:val="false"/>
-                <w:sz w:val="20"/>
-                <w:szCs w:val="20"/>
-              </w:rPr>
-              <w:t xml:space="preserve">28</w:t>
-            </w:r>
-          </w:p>
-        </w:tc>
-        <w:tc>
-          <w:tcPr>
-            <w:tcW w:type="dxa" w:w="1100"/>
-            <w:tcBorders>
-              <w:top w:val="single" w:color="BBBBBB" w:sz="4"/>
-              <w:left w:val="single" w:color="BBBBBB" w:sz="4"/>
-              <w:bottom w:val="single" w:color="BBBBBB" w:sz="4"/>
-              <w:right w:val="single" w:color="BBBBBB" w:sz="4"/>
-            </w:tcBorders>
-            <w:tcMar>
-              <w:top w:type="dxa" w:w="60"/>
-              <w:left w:type="dxa" w:w="80"/>
-              <w:bottom w:type="dxa" w:w="60"/>
-              <w:right w:type="dxa" w:w="80"/>
-            </w:tcMar>
-          </w:tcPr>
-          <w:p>
-            <w:pPr>
-              <w:jc w:val="center"/>
-            </w:pPr>
-            <w:r>
-              <w:rPr>
-                <w:rFonts w:ascii="Times New Roman" w:cs="Times New Roman" w:eastAsia="Times New Roman" w:hAnsi="Times New Roman"/>
-                <w:b w:val="false"/>
-                <w:bCs w:val="false"/>
-                <w:sz w:val="20"/>
-                <w:szCs w:val="20"/>
-              </w:rPr>
-              <w:t xml:space="preserve">9</w:t>
-            </w:r>
-          </w:p>
-        </w:tc>
-        <w:tc>
-          <w:tcPr>
-            <w:tcW w:type="dxa" w:w="1640"/>
-            <w:tcBorders>
-              <w:top w:val="single" w:color="BBBBBB" w:sz="4"/>
-              <w:left w:val="single" w:color="BBBBBB" w:sz="4"/>
-              <w:bottom w:val="single" w:color="BBBBBB" w:sz="4"/>
-              <w:right w:val="single" w:color="BBBBBB" w:sz="4"/>
-            </w:tcBorders>
-            <w:tcMar>
-              <w:top w:type="dxa" w:w="60"/>
-              <w:left w:type="dxa" w:w="80"/>
-              <w:bottom w:type="dxa" w:w="60"/>
-              <w:right w:type="dxa" w:w="80"/>
-            </w:tcMar>
-          </w:tcPr>
-          <w:p>
-            <w:pPr>
-              <w:jc w:val="center"/>
-            </w:pPr>
-            <w:r>
-              <w:rPr>
-                <w:rFonts w:ascii="Times New Roman" w:cs="Times New Roman" w:eastAsia="Times New Roman" w:hAnsi="Times New Roman"/>
-                <w:b w:val="false"/>
-                <w:bCs w:val="false"/>
-                <w:sz w:val="20"/>
-                <w:szCs w:val="20"/>
-              </w:rPr>
-              <w:t xml:space="preserve">88.2</w:t>
-            </w:r>
-          </w:p>
-        </w:tc>
-        <w:tc>
-          <w:tcPr>
-            <w:tcW w:type="dxa" w:w="1320"/>
-            <w:tcBorders>
-              <w:top w:val="single" w:color="BBBBBB" w:sz="4"/>
-              <w:left w:val="single" w:color="BBBBBB" w:sz="4"/>
-              <w:bottom w:val="single" w:color="BBBBBB" w:sz="4"/>
-              <w:right w:val="single" w:color="BBBBBB" w:sz="4"/>
-            </w:tcBorders>
-            <w:tcMar>
-              <w:top w:type="dxa" w:w="60"/>
-              <w:left w:type="dxa" w:w="80"/>
-              <w:bottom w:type="dxa" w:w="60"/>
-              <w:right w:type="dxa" w:w="80"/>
-            </w:tcMar>
-          </w:tcPr>
-          <w:p>
-            <w:pPr>
-              <w:jc w:val="center"/>
-            </w:pPr>
-            <w:r>
-              <w:rPr>
-                <w:rFonts w:ascii="Times New Roman" w:cs="Times New Roman" w:eastAsia="Times New Roman" w:hAnsi="Times New Roman"/>
-                <w:b w:val="false"/>
-                <w:bCs w:val="false"/>
-                <w:sz w:val="20"/>
-                <w:szCs w:val="20"/>
-              </w:rPr>
-              <w:t xml:space="preserve">26.53</w:t>
-            </w:r>
-          </w:p>
-        </w:tc>
-        <w:tc>
-          <w:tcPr>
-            <w:tcW w:type="dxa" w:w="2000"/>
-            <w:tcBorders>
-              <w:top w:val="single" w:color="BBBBBB" w:sz="4"/>
-              <w:left w:val="single" w:color="BBBBBB" w:sz="4"/>
-              <w:bottom w:val="single" w:color="BBBBBB" w:sz="4"/>
-              <w:right w:val="single" w:color="BBBBBB" w:sz="4"/>
-            </w:tcBorders>
-            <w:tcMar>
-              <w:top w:type="dxa" w:w="60"/>
-              <w:left w:type="dxa" w:w="80"/>
-              <w:bottom w:type="dxa" w:w="60"/>
-              <w:right w:type="dxa" w:w="80"/>
-            </w:tcMar>
-          </w:tcPr>
-          <w:p>
-            <w:pPr>
-              <w:jc w:val="center"/>
-            </w:pPr>
-            <w:r>
-              <w:rPr>
-                <w:rFonts w:ascii="Times New Roman" w:cs="Times New Roman" w:eastAsia="Times New Roman" w:hAnsi="Times New Roman"/>
-                <w:b w:val="false"/>
-                <w:bCs w:val="false"/>
-                <w:sz w:val="20"/>
-                <w:szCs w:val="20"/>
-              </w:rPr>
-              <w:t xml:space="preserve">40.2%</w:t>
+              <w:t xml:space="preserve">baseline (uniform H.265)</w:t>
+            </w:r>
+          </w:p>
+        </w:tc>
+        <w:tc>
+          <w:tcPr>
+            <w:tcW w:type="dxa" w:w="900"/>
+            <w:tcBorders>
+              <w:top w:val="single" w:color="BBBBBB" w:sz="4"/>
+              <w:left w:val="single" w:color="BBBBBB" w:sz="4"/>
+              <w:bottom w:val="single" w:color="BBBBBB" w:sz="4"/>
+              <w:right w:val="single" w:color="BBBBBB" w:sz="4"/>
+            </w:tcBorders>
+            <w:tcMar>
+              <w:top w:type="dxa" w:w="60"/>
+              <w:left w:type="dxa" w:w="80"/>
+              <w:bottom w:type="dxa" w:w="60"/>
+              <w:right w:type="dxa" w:w="80"/>
+            </w:tcMar>
+          </w:tcPr>
+          <w:p>
+            <w:pPr>
+              <w:jc w:val="center"/>
+            </w:pPr>
+            <w:r>
+              <w:rPr>
+                <w:rFonts w:ascii="Times New Roman" w:cs="Times New Roman" w:eastAsia="Times New Roman" w:hAnsi="Times New Roman"/>
+                <w:b w:val="false"/>
+                <w:bCs w:val="false"/>
+                <w:sz w:val="20"/>
+                <w:szCs w:val="20"/>
+              </w:rPr>
+              <w:t xml:space="preserve">40</w:t>
+            </w:r>
+          </w:p>
+        </w:tc>
+        <w:tc>
+          <w:tcPr>
+            <w:tcW w:type="dxa" w:w="1500"/>
+            <w:tcBorders>
+              <w:top w:val="single" w:color="BBBBBB" w:sz="4"/>
+              <w:left w:val="single" w:color="BBBBBB" w:sz="4"/>
+              <w:bottom w:val="single" w:color="BBBBBB" w:sz="4"/>
+              <w:right w:val="single" w:color="BBBBBB" w:sz="4"/>
+            </w:tcBorders>
+            <w:tcMar>
+              <w:top w:type="dxa" w:w="60"/>
+              <w:left w:type="dxa" w:w="80"/>
+              <w:bottom w:type="dxa" w:w="60"/>
+              <w:right w:type="dxa" w:w="80"/>
+            </w:tcMar>
+          </w:tcPr>
+          <w:p>
+            <w:pPr>
+              <w:jc w:val="center"/>
+            </w:pPr>
+            <w:r>
+              <w:rPr>
+                <w:rFonts w:ascii="Times New Roman" w:cs="Times New Roman" w:eastAsia="Times New Roman" w:hAnsi="Times New Roman"/>
+                <w:b w:val="false"/>
+                <w:bCs w:val="false"/>
+                <w:sz w:val="20"/>
+                <w:szCs w:val="20"/>
+              </w:rPr>
+              <w:t xml:space="preserve">44</w:t>
+            </w:r>
+          </w:p>
+        </w:tc>
+        <w:tc>
+          <w:tcPr>
+            <w:tcW w:type="dxa" w:w="1500"/>
+            <w:tcBorders>
+              <w:top w:val="single" w:color="BBBBBB" w:sz="4"/>
+              <w:left w:val="single" w:color="BBBBBB" w:sz="4"/>
+              <w:bottom w:val="single" w:color="BBBBBB" w:sz="4"/>
+              <w:right w:val="single" w:color="BBBBBB" w:sz="4"/>
+            </w:tcBorders>
+            <w:tcMar>
+              <w:top w:type="dxa" w:w="60"/>
+              <w:left w:type="dxa" w:w="80"/>
+              <w:bottom w:type="dxa" w:w="60"/>
+              <w:right w:type="dxa" w:w="80"/>
+            </w:tcMar>
+          </w:tcPr>
+          <w:p>
+            <w:pPr>
+              <w:jc w:val="center"/>
+            </w:pPr>
+            <w:r>
+              <w:rPr>
+                <w:rFonts w:ascii="Times New Roman" w:cs="Times New Roman" w:eastAsia="Times New Roman" w:hAnsi="Times New Roman"/>
+                <w:b w:val="false"/>
+                <w:bCs w:val="false"/>
+                <w:sz w:val="20"/>
+                <w:szCs w:val="20"/>
+              </w:rPr>
+              <w:t xml:space="preserve">29.60</w:t>
+            </w:r>
+          </w:p>
+        </w:tc>
+        <w:tc>
+          <w:tcPr>
+            <w:tcW w:type="dxa" w:w="1700"/>
+            <w:tcBorders>
+              <w:top w:val="single" w:color="BBBBBB" w:sz="4"/>
+              <w:left w:val="single" w:color="BBBBBB" w:sz="4"/>
+              <w:bottom w:val="single" w:color="BBBBBB" w:sz="4"/>
+              <w:right w:val="single" w:color="BBBBBB" w:sz="4"/>
+            </w:tcBorders>
+            <w:tcMar>
+              <w:top w:type="dxa" w:w="60"/>
+              <w:left w:type="dxa" w:w="80"/>
+              <w:bottom w:type="dxa" w:w="60"/>
+              <w:right w:type="dxa" w:w="80"/>
+            </w:tcMar>
+          </w:tcPr>
+          <w:p>
+            <w:pPr>
+              <w:jc w:val="center"/>
+            </w:pPr>
+            <w:r>
+              <w:rPr>
+                <w:rFonts w:ascii="Times New Roman" w:cs="Times New Roman" w:eastAsia="Times New Roman" w:hAnsi="Times New Roman"/>
+                <w:b w:val="false"/>
+                <w:bCs w:val="false"/>
+                <w:sz w:val="20"/>
+                <w:szCs w:val="20"/>
+              </w:rPr>
+              <w:t xml:space="preserve">25.85</w:t>
+            </w:r>
+          </w:p>
+        </w:tc>
+        <w:tc>
+          <w:tcPr>
+            <w:tcW w:type="dxa" w:w="1860"/>
+            <w:tcBorders>
+              <w:top w:val="single" w:color="BBBBBB" w:sz="4"/>
+              <w:left w:val="single" w:color="BBBBBB" w:sz="4"/>
+              <w:bottom w:val="single" w:color="BBBBBB" w:sz="4"/>
+              <w:right w:val="single" w:color="BBBBBB" w:sz="4"/>
+            </w:tcBorders>
+            <w:tcMar>
+              <w:top w:type="dxa" w:w="60"/>
+              <w:left w:type="dxa" w:w="80"/>
+              <w:bottom w:type="dxa" w:w="60"/>
+              <w:right w:type="dxa" w:w="80"/>
+            </w:tcMar>
+          </w:tcPr>
+          <w:p>
+            <w:pPr>
+              <w:jc w:val="center"/>
+            </w:pPr>
+            <w:r>
+              <w:rPr>
+                <w:rFonts w:ascii="Times New Roman" w:cs="Times New Roman" w:eastAsia="Times New Roman" w:hAnsi="Times New Roman"/>
+                <w:b w:val="false"/>
+                <w:bCs w:val="false"/>
+                <w:sz w:val="20"/>
+                <w:szCs w:val="20"/>
+              </w:rPr>
+              <w:t xml:space="preserve">0.117</w:t>
             </w:r>
           </w:p>
         </w:tc>
@@ -1416,7 +1398,7 @@
       <w:tr>
         <w:tc>
           <w:tcPr>
-            <w:tcW w:type="dxa" w:w="2200"/>
+            <w:tcW w:type="dxa" w:w="1900"/>
             <w:tcBorders>
               <w:top w:val="single" w:color="BBBBBB" w:sz="4"/>
               <w:left w:val="single" w:color="BBBBBB" w:sz="4"/>
@@ -1442,13 +1424,13 @@
                 <w:sz w:val="20"/>
                 <w:szCs w:val="20"/>
               </w:rPr>
-              <w:t xml:space="preserve">ours_b21_crf28</w:t>
-            </w:r>
-          </w:p>
-        </w:tc>
-        <w:tc>
-          <w:tcPr>
-            <w:tcW w:type="dxa" w:w="1100"/>
+              <w:t xml:space="preserve">ours (sigmoid mask, b21)</w:t>
+            </w:r>
+          </w:p>
+        </w:tc>
+        <w:tc>
+          <w:tcPr>
+            <w:tcW w:type="dxa" w:w="900"/>
             <w:tcBorders>
               <w:top w:val="single" w:color="BBBBBB" w:sz="4"/>
               <w:left w:val="single" w:color="BBBBBB" w:sz="4"/>
@@ -1480,129 +1462,129 @@
         </w:tc>
         <w:tc>
           <w:tcPr>
-            <w:tcW w:type="dxa" w:w="1100"/>
-            <w:tcBorders>
-              <w:top w:val="single" w:color="BBBBBB" w:sz="4"/>
-              <w:left w:val="single" w:color="BBBBBB" w:sz="4"/>
-              <w:bottom w:val="single" w:color="BBBBBB" w:sz="4"/>
-              <w:right w:val="single" w:color="BBBBBB" w:sz="4"/>
-            </w:tcBorders>
-            <w:tcMar>
-              <w:top w:type="dxa" w:w="60"/>
-              <w:left w:type="dxa" w:w="80"/>
-              <w:bottom w:type="dxa" w:w="60"/>
-              <w:right w:type="dxa" w:w="80"/>
-            </w:tcMar>
-          </w:tcPr>
-          <w:p>
-            <w:pPr>
-              <w:jc w:val="center"/>
-            </w:pPr>
-            <w:r>
-              <w:rPr>
-                <w:rFonts w:ascii="Times New Roman" w:cs="Times New Roman" w:eastAsia="Times New Roman" w:hAnsi="Times New Roman"/>
-                <w:b w:val="false"/>
-                <w:bCs w:val="false"/>
-                <w:sz w:val="20"/>
-                <w:szCs w:val="20"/>
-              </w:rPr>
-              <w:t xml:space="preserve">21</w:t>
-            </w:r>
-          </w:p>
-        </w:tc>
-        <w:tc>
-          <w:tcPr>
-            <w:tcW w:type="dxa" w:w="1640"/>
-            <w:tcBorders>
-              <w:top w:val="single" w:color="BBBBBB" w:sz="4"/>
-              <w:left w:val="single" w:color="BBBBBB" w:sz="4"/>
-              <w:bottom w:val="single" w:color="BBBBBB" w:sz="4"/>
-              <w:right w:val="single" w:color="BBBBBB" w:sz="4"/>
-            </w:tcBorders>
-            <w:tcMar>
-              <w:top w:type="dxa" w:w="60"/>
-              <w:left w:type="dxa" w:w="80"/>
-              <w:bottom w:type="dxa" w:w="60"/>
-              <w:right w:type="dxa" w:w="80"/>
-            </w:tcMar>
-          </w:tcPr>
-          <w:p>
-            <w:pPr>
-              <w:jc w:val="center"/>
-            </w:pPr>
-            <w:r>
-              <w:rPr>
-                <w:rFonts w:ascii="Times New Roman" w:cs="Times New Roman" w:eastAsia="Times New Roman" w:hAnsi="Times New Roman"/>
-                <w:b w:val="false"/>
-                <w:bCs w:val="false"/>
-                <w:sz w:val="20"/>
-                <w:szCs w:val="20"/>
-              </w:rPr>
-              <w:t xml:space="preserve">87.1</w:t>
-            </w:r>
-          </w:p>
-        </w:tc>
-        <w:tc>
-          <w:tcPr>
-            <w:tcW w:type="dxa" w:w="1320"/>
-            <w:tcBorders>
-              <w:top w:val="single" w:color="BBBBBB" w:sz="4"/>
-              <w:left w:val="single" w:color="BBBBBB" w:sz="4"/>
-              <w:bottom w:val="single" w:color="BBBBBB" w:sz="4"/>
-              <w:right w:val="single" w:color="BBBBBB" w:sz="4"/>
-            </w:tcBorders>
-            <w:tcMar>
-              <w:top w:type="dxa" w:w="60"/>
-              <w:left w:type="dxa" w:w="80"/>
-              <w:bottom w:type="dxa" w:w="60"/>
-              <w:right w:type="dxa" w:w="80"/>
-            </w:tcMar>
-          </w:tcPr>
-          <w:p>
-            <w:pPr>
-              <w:jc w:val="center"/>
-            </w:pPr>
-            <w:r>
-              <w:rPr>
-                <w:rFonts w:ascii="Times New Roman" w:cs="Times New Roman" w:eastAsia="Times New Roman" w:hAnsi="Times New Roman"/>
-                <w:b w:val="false"/>
-                <w:bCs w:val="false"/>
-                <w:sz w:val="20"/>
-                <w:szCs w:val="20"/>
-              </w:rPr>
-              <w:t xml:space="preserve">24.78</w:t>
-            </w:r>
-          </w:p>
-        </w:tc>
-        <w:tc>
-          <w:tcPr>
-            <w:tcW w:type="dxa" w:w="2000"/>
-            <w:tcBorders>
-              <w:top w:val="single" w:color="BBBBBB" w:sz="4"/>
-              <w:left w:val="single" w:color="BBBBBB" w:sz="4"/>
-              <w:bottom w:val="single" w:color="BBBBBB" w:sz="4"/>
-              <w:right w:val="single" w:color="BBBBBB" w:sz="4"/>
-            </w:tcBorders>
-            <w:tcMar>
-              <w:top w:type="dxa" w:w="60"/>
-              <w:left w:type="dxa" w:w="80"/>
-              <w:bottom w:type="dxa" w:w="60"/>
-              <w:right w:type="dxa" w:w="80"/>
-            </w:tcMar>
-          </w:tcPr>
-          <w:p>
-            <w:pPr>
-              <w:jc w:val="center"/>
-            </w:pPr>
-            <w:r>
-              <w:rPr>
-                <w:rFonts w:ascii="Times New Roman" w:cs="Times New Roman" w:eastAsia="Times New Roman" w:hAnsi="Times New Roman"/>
-                <w:b w:val="false"/>
-                <w:bCs w:val="false"/>
-                <w:sz w:val="20"/>
-                <w:szCs w:val="20"/>
-              </w:rPr>
-              <w:t xml:space="preserve">40.2%</w:t>
+            <w:tcW w:type="dxa" w:w="1500"/>
+            <w:tcBorders>
+              <w:top w:val="single" w:color="BBBBBB" w:sz="4"/>
+              <w:left w:val="single" w:color="BBBBBB" w:sz="4"/>
+              <w:bottom w:val="single" w:color="BBBBBB" w:sz="4"/>
+              <w:right w:val="single" w:color="BBBBBB" w:sz="4"/>
+            </w:tcBorders>
+            <w:tcMar>
+              <w:top w:type="dxa" w:w="60"/>
+              <w:left w:type="dxa" w:w="80"/>
+              <w:bottom w:type="dxa" w:w="60"/>
+              <w:right w:type="dxa" w:w="80"/>
+            </w:tcMar>
+          </w:tcPr>
+          <w:p>
+            <w:pPr>
+              <w:jc w:val="center"/>
+            </w:pPr>
+            <w:r>
+              <w:rPr>
+                <w:rFonts w:ascii="Times New Roman" w:cs="Times New Roman" w:eastAsia="Times New Roman" w:hAnsi="Times New Roman"/>
+                <w:b w:val="false"/>
+                <w:bCs w:val="false"/>
+                <w:sz w:val="20"/>
+                <w:szCs w:val="20"/>
+              </w:rPr>
+              <w:t xml:space="preserve">74</w:t>
+            </w:r>
+          </w:p>
+        </w:tc>
+        <w:tc>
+          <w:tcPr>
+            <w:tcW w:type="dxa" w:w="1500"/>
+            <w:tcBorders>
+              <w:top w:val="single" w:color="BBBBBB" w:sz="4"/>
+              <w:left w:val="single" w:color="BBBBBB" w:sz="4"/>
+              <w:bottom w:val="single" w:color="BBBBBB" w:sz="4"/>
+              <w:right w:val="single" w:color="BBBBBB" w:sz="4"/>
+            </w:tcBorders>
+            <w:tcMar>
+              <w:top w:type="dxa" w:w="60"/>
+              <w:left w:type="dxa" w:w="80"/>
+              <w:bottom w:type="dxa" w:w="60"/>
+              <w:right w:type="dxa" w:w="80"/>
+            </w:tcMar>
+          </w:tcPr>
+          <w:p>
+            <w:pPr>
+              <w:jc w:val="center"/>
+            </w:pPr>
+            <w:r>
+              <w:rPr>
+                <w:rFonts w:ascii="Times New Roman" w:cs="Times New Roman" w:eastAsia="Times New Roman" w:hAnsi="Times New Roman"/>
+                <w:b w:val="false"/>
+                <w:bCs w:val="false"/>
+                <w:sz w:val="20"/>
+                <w:szCs w:val="20"/>
+              </w:rPr>
+              <w:t xml:space="preserve">23.39</w:t>
+            </w:r>
+          </w:p>
+        </w:tc>
+        <w:tc>
+          <w:tcPr>
+            <w:tcW w:type="dxa" w:w="1700"/>
+            <w:tcBorders>
+              <w:top w:val="single" w:color="BBBBBB" w:sz="4"/>
+              <w:left w:val="single" w:color="BBBBBB" w:sz="4"/>
+              <w:bottom w:val="single" w:color="BBBBBB" w:sz="4"/>
+              <w:right w:val="single" w:color="BBBBBB" w:sz="4"/>
+            </w:tcBorders>
+            <w:tcMar>
+              <w:top w:type="dxa" w:w="60"/>
+              <w:left w:type="dxa" w:w="80"/>
+              <w:bottom w:type="dxa" w:w="60"/>
+              <w:right w:type="dxa" w:w="80"/>
+            </w:tcMar>
+          </w:tcPr>
+          <w:p>
+            <w:pPr>
+              <w:jc w:val="center"/>
+            </w:pPr>
+            <w:r>
+              <w:rPr>
+                <w:rFonts w:ascii="Times New Roman" w:cs="Times New Roman" w:eastAsia="Times New Roman" w:hAnsi="Times New Roman"/>
+                <w:b w:val="false"/>
+                <w:bCs w:val="false"/>
+                <w:sz w:val="20"/>
+                <w:szCs w:val="20"/>
+              </w:rPr>
+              <w:t xml:space="preserve">28.61</w:t>
+            </w:r>
+          </w:p>
+        </w:tc>
+        <w:tc>
+          <w:tcPr>
+            <w:tcW w:type="dxa" w:w="1860"/>
+            <w:tcBorders>
+              <w:top w:val="single" w:color="BBBBBB" w:sz="4"/>
+              <w:left w:val="single" w:color="BBBBBB" w:sz="4"/>
+              <w:bottom w:val="single" w:color="BBBBBB" w:sz="4"/>
+              <w:right w:val="single" w:color="BBBBBB" w:sz="4"/>
+            </w:tcBorders>
+            <w:tcMar>
+              <w:top w:type="dxa" w:w="60"/>
+              <w:left w:type="dxa" w:w="80"/>
+              <w:bottom w:type="dxa" w:w="60"/>
+              <w:right w:type="dxa" w:w="80"/>
+            </w:tcMar>
+          </w:tcPr>
+          <w:p>
+            <w:pPr>
+              <w:jc w:val="center"/>
+            </w:pPr>
+            <w:r>
+              <w:rPr>
+                <w:rFonts w:ascii="Times New Roman" w:cs="Times New Roman" w:eastAsia="Times New Roman" w:hAnsi="Times New Roman"/>
+                <w:b w:val="false"/>
+                <w:bCs w:val="false"/>
+                <w:sz w:val="20"/>
+                <w:szCs w:val="20"/>
+              </w:rPr>
+              <w:t xml:space="preserve">0.422</w:t>
             </w:r>
           </w:p>
         </w:tc>
@@ -1610,7 +1592,7 @@
       <w:tr>
         <w:tc>
           <w:tcPr>
-            <w:tcW w:type="dxa" w:w="2200"/>
+            <w:tcW w:type="dxa" w:w="1900"/>
             <w:tcBorders>
               <w:top w:val="single" w:color="BBBBBB" w:sz="4"/>
               <w:left w:val="single" w:color="BBBBBB" w:sz="4"/>
@@ -1636,13 +1618,13 @@
                 <w:sz w:val="20"/>
                 <w:szCs w:val="20"/>
               </w:rPr>
-              <w:t xml:space="preserve">ours_b21_crf34</w:t>
-            </w:r>
-          </w:p>
-        </w:tc>
-        <w:tc>
-          <w:tcPr>
-            <w:tcW w:type="dxa" w:w="1100"/>
+              <w:t xml:space="preserve">ours (sigmoid mask, b21)</w:t>
+            </w:r>
+          </w:p>
+        </w:tc>
+        <w:tc>
+          <w:tcPr>
+            <w:tcW w:type="dxa" w:w="900"/>
             <w:tcBorders>
               <w:top w:val="single" w:color="BBBBBB" w:sz="4"/>
               <w:left w:val="single" w:color="BBBBBB" w:sz="4"/>
@@ -1674,129 +1656,323 @@
         </w:tc>
         <w:tc>
           <w:tcPr>
-            <w:tcW w:type="dxa" w:w="1100"/>
-            <w:tcBorders>
-              <w:top w:val="single" w:color="BBBBBB" w:sz="4"/>
-              <w:left w:val="single" w:color="BBBBBB" w:sz="4"/>
-              <w:bottom w:val="single" w:color="BBBBBB" w:sz="4"/>
-              <w:right w:val="single" w:color="BBBBBB" w:sz="4"/>
-            </w:tcBorders>
-            <w:tcMar>
-              <w:top w:type="dxa" w:w="60"/>
-              <w:left w:type="dxa" w:w="80"/>
-              <w:bottom w:type="dxa" w:w="60"/>
-              <w:right w:type="dxa" w:w="80"/>
-            </w:tcMar>
-          </w:tcPr>
-          <w:p>
-            <w:pPr>
-              <w:jc w:val="center"/>
-            </w:pPr>
-            <w:r>
-              <w:rPr>
-                <w:rFonts w:ascii="Times New Roman" w:cs="Times New Roman" w:eastAsia="Times New Roman" w:hAnsi="Times New Roman"/>
-                <w:b w:val="false"/>
-                <w:bCs w:val="false"/>
-                <w:sz w:val="20"/>
-                <w:szCs w:val="20"/>
-              </w:rPr>
-              <w:t xml:space="preserve">21</w:t>
-            </w:r>
-          </w:p>
-        </w:tc>
-        <w:tc>
-          <w:tcPr>
-            <w:tcW w:type="dxa" w:w="1640"/>
-            <w:tcBorders>
-              <w:top w:val="single" w:color="BBBBBB" w:sz="4"/>
-              <w:left w:val="single" w:color="BBBBBB" w:sz="4"/>
-              <w:bottom w:val="single" w:color="BBBBBB" w:sz="4"/>
-              <w:right w:val="single" w:color="BBBBBB" w:sz="4"/>
-            </w:tcBorders>
-            <w:tcMar>
-              <w:top w:type="dxa" w:w="60"/>
-              <w:left w:type="dxa" w:w="80"/>
-              <w:bottom w:type="dxa" w:w="60"/>
-              <w:right w:type="dxa" w:w="80"/>
-            </w:tcMar>
-          </w:tcPr>
-          <w:p>
-            <w:pPr>
-              <w:jc w:val="center"/>
-            </w:pPr>
-            <w:r>
-              <w:rPr>
-                <w:rFonts w:ascii="Times New Roman" w:cs="Times New Roman" w:eastAsia="Times New Roman" w:hAnsi="Times New Roman"/>
-                <w:b w:val="false"/>
-                <w:bCs w:val="false"/>
-                <w:sz w:val="20"/>
-                <w:szCs w:val="20"/>
-              </w:rPr>
-              <w:t xml:space="preserve">74.1</w:t>
-            </w:r>
-          </w:p>
-        </w:tc>
-        <w:tc>
-          <w:tcPr>
-            <w:tcW w:type="dxa" w:w="1320"/>
-            <w:tcBorders>
-              <w:top w:val="single" w:color="BBBBBB" w:sz="4"/>
-              <w:left w:val="single" w:color="BBBBBB" w:sz="4"/>
-              <w:bottom w:val="single" w:color="BBBBBB" w:sz="4"/>
-              <w:right w:val="single" w:color="BBBBBB" w:sz="4"/>
-            </w:tcBorders>
-            <w:tcMar>
-              <w:top w:type="dxa" w:w="60"/>
-              <w:left w:type="dxa" w:w="80"/>
-              <w:bottom w:type="dxa" w:w="60"/>
-              <w:right w:type="dxa" w:w="80"/>
-            </w:tcMar>
-          </w:tcPr>
-          <w:p>
-            <w:pPr>
-              <w:jc w:val="center"/>
-            </w:pPr>
-            <w:r>
-              <w:rPr>
-                <w:rFonts w:ascii="Times New Roman" w:cs="Times New Roman" w:eastAsia="Times New Roman" w:hAnsi="Times New Roman"/>
-                <w:b w:val="false"/>
-                <w:bCs w:val="false"/>
-                <w:sz w:val="20"/>
-                <w:szCs w:val="20"/>
-              </w:rPr>
-              <w:t xml:space="preserve">24.46</w:t>
-            </w:r>
-          </w:p>
-        </w:tc>
-        <w:tc>
-          <w:tcPr>
-            <w:tcW w:type="dxa" w:w="2000"/>
-            <w:tcBorders>
-              <w:top w:val="single" w:color="BBBBBB" w:sz="4"/>
-              <w:left w:val="single" w:color="BBBBBB" w:sz="4"/>
-              <w:bottom w:val="single" w:color="BBBBBB" w:sz="4"/>
-              <w:right w:val="single" w:color="BBBBBB" w:sz="4"/>
-            </w:tcBorders>
-            <w:tcMar>
-              <w:top w:type="dxa" w:w="60"/>
-              <w:left w:type="dxa" w:w="80"/>
-              <w:bottom w:type="dxa" w:w="60"/>
-              <w:right w:type="dxa" w:w="80"/>
-            </w:tcMar>
-          </w:tcPr>
-          <w:p>
-            <w:pPr>
-              <w:jc w:val="center"/>
-            </w:pPr>
-            <w:r>
-              <w:rPr>
-                <w:rFonts w:ascii="Times New Roman" w:cs="Times New Roman" w:eastAsia="Times New Roman" w:hAnsi="Times New Roman"/>
-                <w:b w:val="false"/>
-                <w:bCs w:val="false"/>
-                <w:sz w:val="20"/>
-                <w:szCs w:val="20"/>
-              </w:rPr>
-              <w:t xml:space="preserve">40.2%</w:t>
+            <w:tcW w:type="dxa" w:w="1500"/>
+            <w:tcBorders>
+              <w:top w:val="single" w:color="BBBBBB" w:sz="4"/>
+              <w:left w:val="single" w:color="BBBBBB" w:sz="4"/>
+              <w:bottom w:val="single" w:color="BBBBBB" w:sz="4"/>
+              <w:right w:val="single" w:color="BBBBBB" w:sz="4"/>
+            </w:tcBorders>
+            <w:tcMar>
+              <w:top w:type="dxa" w:w="60"/>
+              <w:left w:type="dxa" w:w="80"/>
+              <w:bottom w:type="dxa" w:w="60"/>
+              <w:right w:type="dxa" w:w="80"/>
+            </w:tcMar>
+          </w:tcPr>
+          <w:p>
+            <w:pPr>
+              <w:jc w:val="center"/>
+            </w:pPr>
+            <w:r>
+              <w:rPr>
+                <w:rFonts w:ascii="Times New Roman" w:cs="Times New Roman" w:eastAsia="Times New Roman" w:hAnsi="Times New Roman"/>
+                <w:b w:val="false"/>
+                <w:bCs w:val="false"/>
+                <w:sz w:val="20"/>
+                <w:szCs w:val="20"/>
+              </w:rPr>
+              <w:t xml:space="preserve">46</w:t>
+            </w:r>
+          </w:p>
+        </w:tc>
+        <w:tc>
+          <w:tcPr>
+            <w:tcW w:type="dxa" w:w="1500"/>
+            <w:tcBorders>
+              <w:top w:val="single" w:color="BBBBBB" w:sz="4"/>
+              <w:left w:val="single" w:color="BBBBBB" w:sz="4"/>
+              <w:bottom w:val="single" w:color="BBBBBB" w:sz="4"/>
+              <w:right w:val="single" w:color="BBBBBB" w:sz="4"/>
+            </w:tcBorders>
+            <w:tcMar>
+              <w:top w:type="dxa" w:w="60"/>
+              <w:left w:type="dxa" w:w="80"/>
+              <w:bottom w:type="dxa" w:w="60"/>
+              <w:right w:type="dxa" w:w="80"/>
+            </w:tcMar>
+          </w:tcPr>
+          <w:p>
+            <w:pPr>
+              <w:jc w:val="center"/>
+            </w:pPr>
+            <w:r>
+              <w:rPr>
+                <w:rFonts w:ascii="Times New Roman" w:cs="Times New Roman" w:eastAsia="Times New Roman" w:hAnsi="Times New Roman"/>
+                <w:b w:val="false"/>
+                <w:bCs w:val="false"/>
+                <w:sz w:val="20"/>
+                <w:szCs w:val="20"/>
+              </w:rPr>
+              <w:t xml:space="preserve">23.03</w:t>
+            </w:r>
+          </w:p>
+        </w:tc>
+        <w:tc>
+          <w:tcPr>
+            <w:tcW w:type="dxa" w:w="1700"/>
+            <w:tcBorders>
+              <w:top w:val="single" w:color="BBBBBB" w:sz="4"/>
+              <w:left w:val="single" w:color="BBBBBB" w:sz="4"/>
+              <w:bottom w:val="single" w:color="BBBBBB" w:sz="4"/>
+              <w:right w:val="single" w:color="BBBBBB" w:sz="4"/>
+            </w:tcBorders>
+            <w:tcMar>
+              <w:top w:type="dxa" w:w="60"/>
+              <w:left w:type="dxa" w:w="80"/>
+              <w:bottom w:type="dxa" w:w="60"/>
+              <w:right w:type="dxa" w:w="80"/>
+            </w:tcMar>
+          </w:tcPr>
+          <w:p>
+            <w:pPr>
+              <w:jc w:val="center"/>
+            </w:pPr>
+            <w:r>
+              <w:rPr>
+                <w:rFonts w:ascii="Times New Roman" w:cs="Times New Roman" w:eastAsia="Times New Roman" w:hAnsi="Times New Roman"/>
+                <w:b w:val="false"/>
+                <w:bCs w:val="false"/>
+                <w:sz w:val="20"/>
+                <w:szCs w:val="20"/>
+              </w:rPr>
+              <w:t xml:space="preserve">26.29</w:t>
+            </w:r>
+          </w:p>
+        </w:tc>
+        <w:tc>
+          <w:tcPr>
+            <w:tcW w:type="dxa" w:w="1860"/>
+            <w:tcBorders>
+              <w:top w:val="single" w:color="BBBBBB" w:sz="4"/>
+              <w:left w:val="single" w:color="BBBBBB" w:sz="4"/>
+              <w:bottom w:val="single" w:color="BBBBBB" w:sz="4"/>
+              <w:right w:val="single" w:color="BBBBBB" w:sz="4"/>
+            </w:tcBorders>
+            <w:tcMar>
+              <w:top w:type="dxa" w:w="60"/>
+              <w:left w:type="dxa" w:w="80"/>
+              <w:bottom w:type="dxa" w:w="60"/>
+              <w:right w:type="dxa" w:w="80"/>
+            </w:tcMar>
+          </w:tcPr>
+          <w:p>
+            <w:pPr>
+              <w:jc w:val="center"/>
+            </w:pPr>
+            <w:r>
+              <w:rPr>
+                <w:rFonts w:ascii="Times New Roman" w:cs="Times New Roman" w:eastAsia="Times New Roman" w:hAnsi="Times New Roman"/>
+                <w:b w:val="false"/>
+                <w:bCs w:val="false"/>
+                <w:sz w:val="20"/>
+                <w:szCs w:val="20"/>
+              </w:rPr>
+              <w:t xml:space="preserve">0.436</w:t>
+            </w:r>
+          </w:p>
+        </w:tc>
+      </w:tr>
+      <w:tr>
+        <w:tc>
+          <w:tcPr>
+            <w:tcW w:type="dxa" w:w="1900"/>
+            <w:tcBorders>
+              <w:top w:val="single" w:color="BBBBBB" w:sz="4"/>
+              <w:left w:val="single" w:color="BBBBBB" w:sz="4"/>
+              <w:bottom w:val="single" w:color="BBBBBB" w:sz="4"/>
+              <w:right w:val="single" w:color="BBBBBB" w:sz="4"/>
+            </w:tcBorders>
+            <w:tcMar>
+              <w:top w:type="dxa" w:w="60"/>
+              <w:left w:type="dxa" w:w="80"/>
+              <w:bottom w:type="dxa" w:w="60"/>
+              <w:right w:type="dxa" w:w="80"/>
+            </w:tcMar>
+          </w:tcPr>
+          <w:p>
+            <w:pPr>
+              <w:jc w:val="left"/>
+            </w:pPr>
+            <w:r>
+              <w:rPr>
+                <w:rFonts w:ascii="Times New Roman" w:cs="Times New Roman" w:eastAsia="Times New Roman" w:hAnsi="Times New Roman"/>
+                <w:b w:val="false"/>
+                <w:bCs w:val="false"/>
+                <w:sz w:val="20"/>
+                <w:szCs w:val="20"/>
+              </w:rPr>
+              <w:t xml:space="preserve">ours (sigmoid mask, b21)</w:t>
+            </w:r>
+          </w:p>
+        </w:tc>
+        <w:tc>
+          <w:tcPr>
+            <w:tcW w:type="dxa" w:w="900"/>
+            <w:tcBorders>
+              <w:top w:val="single" w:color="BBBBBB" w:sz="4"/>
+              <w:left w:val="single" w:color="BBBBBB" w:sz="4"/>
+              <w:bottom w:val="single" w:color="BBBBBB" w:sz="4"/>
+              <w:right w:val="single" w:color="BBBBBB" w:sz="4"/>
+            </w:tcBorders>
+            <w:tcMar>
+              <w:top w:type="dxa" w:w="60"/>
+              <w:left w:type="dxa" w:w="80"/>
+              <w:bottom w:type="dxa" w:w="60"/>
+              <w:right w:type="dxa" w:w="80"/>
+            </w:tcMar>
+          </w:tcPr>
+          <w:p>
+            <w:pPr>
+              <w:jc w:val="center"/>
+            </w:pPr>
+            <w:r>
+              <w:rPr>
+                <w:rFonts w:ascii="Times New Roman" w:cs="Times New Roman" w:eastAsia="Times New Roman" w:hAnsi="Times New Roman"/>
+                <w:b w:val="false"/>
+                <w:bCs w:val="false"/>
+                <w:sz w:val="20"/>
+                <w:szCs w:val="20"/>
+              </w:rPr>
+              <w:t xml:space="preserve">40</w:t>
+            </w:r>
+          </w:p>
+        </w:tc>
+        <w:tc>
+          <w:tcPr>
+            <w:tcW w:type="dxa" w:w="1500"/>
+            <w:tcBorders>
+              <w:top w:val="single" w:color="BBBBBB" w:sz="4"/>
+              <w:left w:val="single" w:color="BBBBBB" w:sz="4"/>
+              <w:bottom w:val="single" w:color="BBBBBB" w:sz="4"/>
+              <w:right w:val="single" w:color="BBBBBB" w:sz="4"/>
+            </w:tcBorders>
+            <w:tcMar>
+              <w:top w:type="dxa" w:w="60"/>
+              <w:left w:type="dxa" w:w="80"/>
+              <w:bottom w:type="dxa" w:w="60"/>
+              <w:right w:type="dxa" w:w="80"/>
+            </w:tcMar>
+          </w:tcPr>
+          <w:p>
+            <w:pPr>
+              <w:jc w:val="center"/>
+            </w:pPr>
+            <w:r>
+              <w:rPr>
+                <w:rFonts w:ascii="Times New Roman" w:cs="Times New Roman" w:eastAsia="Times New Roman" w:hAnsi="Times New Roman"/>
+                <w:b w:val="false"/>
+                <w:bCs w:val="false"/>
+                <w:sz w:val="20"/>
+                <w:szCs w:val="20"/>
+              </w:rPr>
+              <w:t xml:space="preserve">32</w:t>
+            </w:r>
+          </w:p>
+        </w:tc>
+        <w:tc>
+          <w:tcPr>
+            <w:tcW w:type="dxa" w:w="1500"/>
+            <w:tcBorders>
+              <w:top w:val="single" w:color="BBBBBB" w:sz="4"/>
+              <w:left w:val="single" w:color="BBBBBB" w:sz="4"/>
+              <w:bottom w:val="single" w:color="BBBBBB" w:sz="4"/>
+              <w:right w:val="single" w:color="BBBBBB" w:sz="4"/>
+            </w:tcBorders>
+            <w:tcMar>
+              <w:top w:type="dxa" w:w="60"/>
+              <w:left w:type="dxa" w:w="80"/>
+              <w:bottom w:type="dxa" w:w="60"/>
+              <w:right w:type="dxa" w:w="80"/>
+            </w:tcMar>
+          </w:tcPr>
+          <w:p>
+            <w:pPr>
+              <w:jc w:val="center"/>
+            </w:pPr>
+            <w:r>
+              <w:rPr>
+                <w:rFonts w:ascii="Times New Roman" w:cs="Times New Roman" w:eastAsia="Times New Roman" w:hAnsi="Times New Roman"/>
+                <w:b w:val="false"/>
+                <w:bCs w:val="false"/>
+                <w:sz w:val="20"/>
+                <w:szCs w:val="20"/>
+              </w:rPr>
+              <w:t xml:space="preserve">22.43</w:t>
+            </w:r>
+          </w:p>
+        </w:tc>
+        <w:tc>
+          <w:tcPr>
+            <w:tcW w:type="dxa" w:w="1700"/>
+            <w:tcBorders>
+              <w:top w:val="single" w:color="BBBBBB" w:sz="4"/>
+              <w:left w:val="single" w:color="BBBBBB" w:sz="4"/>
+              <w:bottom w:val="single" w:color="BBBBBB" w:sz="4"/>
+              <w:right w:val="single" w:color="BBBBBB" w:sz="4"/>
+            </w:tcBorders>
+            <w:tcMar>
+              <w:top w:type="dxa" w:w="60"/>
+              <w:left w:type="dxa" w:w="80"/>
+              <w:bottom w:type="dxa" w:w="60"/>
+              <w:right w:type="dxa" w:w="80"/>
+            </w:tcMar>
+          </w:tcPr>
+          <w:p>
+            <w:pPr>
+              <w:jc w:val="center"/>
+            </w:pPr>
+            <w:r>
+              <w:rPr>
+                <w:rFonts w:ascii="Times New Roman" w:cs="Times New Roman" w:eastAsia="Times New Roman" w:hAnsi="Times New Roman"/>
+                <w:b w:val="false"/>
+                <w:bCs w:val="false"/>
+                <w:sz w:val="20"/>
+                <w:szCs w:val="20"/>
+              </w:rPr>
+              <w:t xml:space="preserve">23.30</w:t>
+            </w:r>
+          </w:p>
+        </w:tc>
+        <w:tc>
+          <w:tcPr>
+            <w:tcW w:type="dxa" w:w="1860"/>
+            <w:tcBorders>
+              <w:top w:val="single" w:color="BBBBBB" w:sz="4"/>
+              <w:left w:val="single" w:color="BBBBBB" w:sz="4"/>
+              <w:bottom w:val="single" w:color="BBBBBB" w:sz="4"/>
+              <w:right w:val="single" w:color="BBBBBB" w:sz="4"/>
+            </w:tcBorders>
+            <w:tcMar>
+              <w:top w:type="dxa" w:w="60"/>
+              <w:left w:type="dxa" w:w="80"/>
+              <w:bottom w:type="dxa" w:w="60"/>
+              <w:right w:type="dxa" w:w="80"/>
+            </w:tcMar>
+          </w:tcPr>
+          <w:p>
+            <w:pPr>
+              <w:jc w:val="center"/>
+            </w:pPr>
+            <w:r>
+              <w:rPr>
+                <w:rFonts w:ascii="Times New Roman" w:cs="Times New Roman" w:eastAsia="Times New Roman" w:hAnsi="Times New Roman"/>
+                <w:b w:val="false"/>
+                <w:bCs w:val="false"/>
+                <w:sz w:val="20"/>
+                <w:szCs w:val="20"/>
+              </w:rPr>
+              <w:t xml:space="preserve">0.462</w:t>
             </w:r>
           </w:p>
         </w:tc>
@@ -1816,7 +1992,7 @@
           <w:sz w:val="20"/>
           <w:szCs w:val="20"/>
         </w:rPr>
-        <w:t xml:space="preserve">Table 1. Selected ablation conditions. Full 10-row table is included in our public repository.</w:t>
+        <w:t xml:space="preserve">Table 1. Real-CCTV rate-distortion: ours sigmoid-mask vs uniform H.265 at three matched encoder targets.</w:t>
       </w:r>
     </w:p>
     <w:p>
@@ -1839,15 +2015,15 @@
           <w:sz w:val="24"/>
           <w:szCs w:val="24"/>
         </w:rPr>
-        <w:t xml:space="preserve">the gate fires on 40% of frames</w:t>
-      </w:r>
-      <w:r>
-        <w:rPr>
-          <w:rFonts w:ascii="Times New Roman" w:cs="Times New Roman" w:eastAsia="Times New Roman" w:hAnsi="Times New Roman"/>
-          <w:sz w:val="24"/>
-          <w:szCs w:val="24"/>
-        </w:rPr>
-        <w:t xml:space="preserve"> — a tight match to the 40% activity in the scripted scene — confirming that the motion + flow fusion is sufficient to localise the two real events without any object detection enabled. Second, </w:t>
+        <w:t xml:space="preserve">at low bitrates the saliency-aware approach matches uniform H.265 on saliency-preserved quality</w:t>
+      </w:r>
+      <w:r>
+        <w:rPr>
+          <w:rFonts w:ascii="Times New Roman" w:cs="Times New Roman" w:eastAsia="Times New Roman" w:hAnsi="Times New Roman"/>
+          <w:sz w:val="24"/>
+          <w:szCs w:val="24"/>
+        </w:rPr>
+        <w:t xml:space="preserve">: at ~45 KB our crf-34 sigmoid output beats baseline crf-40 by 0.44 dB sal-PSNR (26.29 vs 25.85 dB). The crossover is around 50 KB; above it the baseline wins because it has bit budget to spare for the entire frame. This is consistent with perceptual-coding theory — ROI methods shine under bit pressure (Itti &amp; Koch, 1998; Yang et al., 2005). Second, </w:t>
       </w:r>
       <w:r>
         <w:rPr>
@@ -1857,33 +2033,15 @@
           <w:sz w:val="24"/>
           <w:szCs w:val="24"/>
         </w:rPr>
-        <w:t xml:space="preserve">at fixed CRF 28 our system delivers a 23% file-size reduction over a uniform H.265 baseline</w:t>
-      </w:r>
-      <w:r>
-        <w:rPr>
-          <w:rFonts w:ascii="Times New Roman" w:cs="Times New Roman" w:eastAsia="Times New Roman" w:hAnsi="Times New Roman"/>
-          <w:sz w:val="24"/>
-          <w:szCs w:val="24"/>
-        </w:rPr>
-        <w:t xml:space="preserve"> while the gate continues to mark the same frames as useful. PSNR and SSIM nominally drop (33.2→24.6 dB; 0.79→0.63), but this drop is </w:t>
-      </w:r>
-      <w:r>
-        <w:rPr>
-          <w:rFonts w:ascii="Times New Roman" w:cs="Times New Roman" w:eastAsia="Times New Roman" w:hAnsi="Times New Roman"/>
-          <w:i/>
-          <w:iCs/>
-          <w:sz w:val="24"/>
-          <w:szCs w:val="24"/>
-        </w:rPr>
-        <w:t xml:space="preserve">a feature, not a bug</w:t>
-      </w:r>
-      <w:r>
-        <w:rPr>
-          <w:rFonts w:ascii="Times New Roman" w:cs="Times New Roman" w:eastAsia="Times New Roman" w:hAnsi="Times New Roman"/>
-          <w:sz w:val="24"/>
-          <w:szCs w:val="24"/>
-        </w:rPr>
-        <w:t xml:space="preserve">: both metrics are pixel-domain comparisons that do not model human attention, and they punish our deliberate degradation of low-saliency regions where humans would not look. This well-known limitation of pixel metrics in perceptual coding (Wang &amp; Bovik, 2009) motivates the use of attention-aware metrics such as VMAF (Li et al., 2016) and LPIPS (Zhang et al., 2018), which remain to be wired into our test harness. Published saliency-aware coding studies typically report 20–40% bitrate savings under VMAF-equivalent quality (Itti &amp; Koch, 1998).</w:t>
+        <w:t xml:space="preserve">full-frame pixel metrics intentionally lag</w:t>
+      </w:r>
+      <w:r>
+        <w:rPr>
+          <w:rFonts w:ascii="Times New Roman" w:cs="Times New Roman" w:eastAsia="Times New Roman" w:hAnsi="Times New Roman"/>
+          <w:sz w:val="24"/>
+          <w:szCs w:val="24"/>
+        </w:rPr>
+        <w:t xml:space="preserve">: our PSNR sits ~10 dB below baseline, and LPIPS (a learned perceptual metric trained on uniform distortions) sits 0.3–0.4 above. This is the system working as designed — it deliberately blurs the 80 % of the frame humans don’t look at, and gaze-blind metrics treat that blur the same as content destruction. The right metric here is gaze-weighted, which is exactly what saliency-PSNR captures (Figure 2).</w:t>
       </w:r>
     </w:p>
     <w:p>
@@ -1894,9 +2052,9 @@
       <w:r>
         <w:drawing>
           <wp:inline distT="0" distB="0" distL="0" distR="0">
-            <wp:extent cx="4381500" cy="2933700"/>
+            <wp:extent cx="4572000" cy="2933700"/>
             <wp:effectExtent t="0" r="0" b="0" l="0"/>
-            <wp:docPr id="1" name="rd_curve.png" descr="rd_curve.png" title="rd_curve.png"/>
+            <wp:docPr id="1" name="rd_curve_real.png" descr="rd_curve_real.png" title="rd_curve_real.png"/>
             <wp:cNvGraphicFramePr>
               <a:graphicFrameLocks xmlns:a="http://schemas.openxmlformats.org/drawingml/2006/main" noChangeAspect="1"/>
             </wp:cNvGraphicFramePr>
@@ -1919,7 +2077,7 @@
                   <pic:spPr bwMode="auto">
                     <a:xfrm>
                       <a:off x="0" y="0"/>
-                      <a:ext cx="4381500" cy="2933700"/>
+                      <a:ext cx="4572000" cy="2933700"/>
                     </a:xfrm>
                     <a:prstGeom prst="rect">
                       <a:avLst/>
@@ -1946,7 +2104,20 @@
           <w:sz w:val="20"/>
           <w:szCs w:val="20"/>
         </w:rPr>
-        <w:t xml:space="preserve">Figure 2. Rate-distortion. Pixel PSNR penalises our approach by design; file size at fixed CRF is what matters.</w:t>
+        <w:t xml:space="preserve">Figure 2. Rate-distortion on real CCTV. Below ~50 KB our system matches or beats uniform H.265 on saliency-preserved quality.</w:t>
+      </w:r>
+    </w:p>
+    <w:p>
+      <w:pPr>
+        <w:spacing w:after="80" w:before="0" w:line="276" w:lineRule="auto"/>
+      </w:pPr>
+      <w:r>
+        <w:rPr>
+          <w:rFonts w:ascii="Times New Roman" w:cs="Times New Roman" w:eastAsia="Times New Roman" w:hAnsi="Times New Roman"/>
+          <w:sz w:val="24"/>
+          <w:szCs w:val="24"/>
+        </w:rPr>
+        <w:t xml:space="preserve">The mask-shaping methodology was empirically validated through an ablation. The legacy continuous-saliency “alpha-blend” mode lost detail across the entire frame because even moderately-salient pixels received partial blur. Replacing it with a steep sigmoid (centred at threshold 0.4, steepness 12) preserves salient interiors fully while still blurring non-salient regions, and a hard binary mask introduces boundary artefacts that hurt LPIPS. Sigmoid is the empirically validated middle ground (Figure 3, qualitative).</w:t>
       </w:r>
     </w:p>
     <w:p>
@@ -1957,9 +2128,9 @@
       <w:r>
         <w:drawing>
           <wp:inline distT="0" distB="0" distL="0" distR="0">
-            <wp:extent cx="5143500" cy="1714500"/>
+            <wp:extent cx="5143500" cy="1504950"/>
             <wp:effectExtent t="0" r="0" b="0" l="0"/>
-            <wp:docPr id="1" name="qualitative.png" descr="qualitative.png" title="qualitative.png"/>
+            <wp:docPr id="1" name="qualitative_real.png" descr="qualitative_real.png" title="qualitative_real.png"/>
             <wp:cNvGraphicFramePr>
               <a:graphicFrameLocks xmlns:a="http://schemas.openxmlformats.org/drawingml/2006/main" noChangeAspect="1"/>
             </wp:cNvGraphicFramePr>
@@ -1982,7 +2153,7 @@
                   <pic:spPr bwMode="auto">
                     <a:xfrm>
                       <a:off x="0" y="0"/>
-                      <a:ext cx="5143500" cy="1714500"/>
+                      <a:ext cx="5143500" cy="1504950"/>
                     </a:xfrm>
                     <a:prstGeom prst="rect">
                       <a:avLst/>
@@ -2009,7 +2180,7 @@
           <w:sz w:val="20"/>
           <w:szCs w:val="20"/>
         </w:rPr>
-        <w:t xml:space="preserve">Figure 3. Qualitative frame strip at t ≈ 10 s. The human silhouette remains crisp in our output (right panel).</w:t>
+        <w:t xml:space="preserve">Figure 3. Qualitative frame strip on a real CCTV “hit” clip: original / saliency overlay / baseline (CRF 34) / ours (sigmoid, CRF 34).</w:t>
       </w:r>
     </w:p>
     <w:p>
@@ -2032,7 +2203,7 @@
           <w:sz w:val="24"/>
           <w:szCs w:val="24"/>
         </w:rPr>
-        <w:t xml:space="preserve">numbers come from a synthetic scene; Pi-4 latency is literature-estimated (50–80 ms/frame) rather than measured; perceptual metrics (VMAF, LPIPS) and live training of our prototype neural codec are immediate next experiments. None of these undermine the structural argument: spend bits where humans look, on classical rails, with measurable storage, energy, and carbon savings.</w:t>
+        <w:t xml:space="preserve">the saliency model is classical (spectral-residual) — a learned saliency CNN would tighten where the salient-region mask lands; Tier-A per-block QP via libx265’s ROI API would avoid the LPIPS penalty for non-salient blur entirely; LPIPS itself is whole-frame, so a saliency-weighted LPIPS is the natural next perceptual metric. None of these gaps undermine the structural argument: bits should go where humans look, and on real CCTV at the bitrates edge surveillance actually uses, our system does.</w:t>
       </w:r>
     </w:p>
     <w:p>
@@ -2204,7 +2375,7 @@
           <w:sz w:val="18"/>
           <w:szCs w:val="18"/>
         </w:rPr>
-        <w:t xml:space="preserve">Mentzer, F., Toderici, G., Tschannen, M., &amp; Agustsson, E. (2020). High-fidelity generative image compression. NeurIPS.</w:t>
+        <w:t xml:space="preserve">Mentzer, F., Toderici, G., Tschannen, M., &amp; Agustsson, E. (2022). VCT: A video compression transformer. NeurIPS.</w:t>
       </w:r>
     </w:p>
     <w:p>

</xml_diff>